<commit_message>
Deliverables rewrite, screenshots, study and demo guides, VM screen in browser
- Shorter title; Proposal (11 pp) and Review-I (12 pp) rewritten in plain
  language; final report with screenshots throughout and a live-demo section
- GUIDE.md / Study Guide PDF with diagrams, glossary and code tour
- DEMO.md / Demo Guide PDF, including a tested type-it-yourself sequence
- live_demo.py: VM screen via QEMU VNC + vendored noVNC, shell mode,
  stop a leftover VM before starting, no audio backend, --step option
- dashboard: VM screen embed, query-param navigation, zombie reaping
- scripts: demo_ready.sh, capture_screenshots.py, winshot.ps1,
  build_demo_guide.py
</commit_message>
<xml_diff>
--- a/docs/KernelLeakGuard_Project_Proposal.docx
+++ b/docs/KernelLeakGuard_Project_Proposal.docx
@@ -276,7 +276,7 @@
           <w:sz w:val="34"/>
           <w:szCs w:val="48"/>
         </w:rPr>
-        <w:t>KernelLeakGuard: Hybrid Static Analysis and Runtime Verification of Memory Leaks in Linux Kernel Early-Exit Paths</w:t>
+        <w:t>KernelLeakGuard: Detecting and Verifying Linux Kernel Memory Leaks</w:t>
       </w:r>
     </w:p>
     <w:p>
@@ -761,7 +761,7 @@
         <w:pStyle w:val="Heading2"/>
       </w:pPr>
       <w:r>
-        <w:t>1. Problem Statement</w:t>
+        <w:t>1. Introduction</w:t>
       </w:r>
     </w:p>
     <w:p>
@@ -772,13 +772,81 @@
         <w:rPr>
           <w:rFonts w:cs="Times New Roman"/>
         </w:rPr>
-        <w:t>Linux kernel routines exit early when an allocation or a device operation fails. Each early exit must release everything acquired so far; a forgotten kfree() leaks kernel memory permanently. Because such paths run only when something fails, testing rarely executes them, and static analysers report many warnings that are not real leaks. The problem addressed is: find memory leaks on kernel early-exit paths and automatically verify each finding by reproducing the failure in an isolated virtual machine, so tha</w:t>
-      </w:r>
-      <w:r>
-        <w:rPr>
-          <w:rFonts w:cs="Times New Roman"/>
-        </w:rPr>
-        <w:t>t only evidence-backed leaks reach the developer.</w:t>
+        <w:t xml:space="preserve">Every program needs memory while it works, and it is supposed to give that memory back when it is done. The Linux kernel — the core of the operating system that runs Android phones, most web servers, cloud machines and many embedded devices — is no different. Kernel code asks for memory with functions such as </w:t>
+      </w:r>
+      <w:r>
+        <w:rPr>
+          <w:rFonts w:ascii="Consolas" w:eastAsia="Consolas" w:hAnsi="Consolas" w:cs="Consolas"/>
+          <w:sz w:val="22"/>
+        </w:rPr>
+        <w:t>kmalloc()</w:t>
+      </w:r>
+      <w:r>
+        <w:rPr>
+          <w:rFonts w:cs="Times New Roman"/>
+        </w:rPr>
+        <w:t xml:space="preserve"> and must return it with </w:t>
+      </w:r>
+      <w:r>
+        <w:rPr>
+          <w:rFonts w:ascii="Consolas" w:eastAsia="Consolas" w:hAnsi="Consolas" w:cs="Consolas"/>
+          <w:sz w:val="22"/>
+        </w:rPr>
+        <w:t>kfree()</w:t>
+      </w:r>
+      <w:r>
+        <w:rPr>
+          <w:rFonts w:cs="Times New Roman"/>
+        </w:rPr>
+        <w:t xml:space="preserve">. If a piece of kernel code forgets to return memory, that memory is gone until the machine is restarted. This is called a </w:t>
+      </w:r>
+      <w:r>
+        <w:rPr>
+          <w:rFonts w:cs="Times New Roman"/>
+          <w:b/>
+        </w:rPr>
+        <w:t>memory leak</w:t>
+      </w:r>
+      <w:r>
+        <w:rPr>
+          <w:rFonts w:cs="Times New Roman"/>
+        </w:rPr>
+        <w:t>.</w:t>
+      </w:r>
+    </w:p>
+    <w:p>
+      <w:pPr>
+        <w:jc w:val="both"/>
+      </w:pPr>
+      <w:r>
+        <w:rPr>
+          <w:rFonts w:cs="Times New Roman"/>
+        </w:rPr>
+        <w:t>Leaks in normal applications are annoying; leaks in the kernel are worse. The kernel has no garbage collector and nobody cleans up after it when a program exits, so every leaked byte stays lost. A machine that is meant to run for months slowly loses memory, gets slower and may finally crash. If an attacker can trigger the leaky code again and again, the leak even becomes a way to bring the machine down (a denial-of-service attack).</w:t>
+      </w:r>
+    </w:p>
+    <w:p>
+      <w:pPr>
+        <w:jc w:val="both"/>
+      </w:pPr>
+      <w:r>
+        <w:rPr>
+          <w:rFonts w:cs="Times New Roman"/>
+        </w:rPr>
+        <w:t xml:space="preserve">This project builds </w:t>
+      </w:r>
+      <w:r>
+        <w:rPr>
+          <w:rFonts w:cs="Times New Roman"/>
+          <w:b/>
+        </w:rPr>
+        <w:t>KernelLeakGuard</w:t>
+      </w:r>
+      <w:r>
+        <w:rPr>
+          <w:rFonts w:cs="Times New Roman"/>
+        </w:rPr>
+        <w:t>, a tool that finds such leaks automatically, proves that each one is real by reproducing it inside a running Linux kernel, and suggests a fix. This proposal explains the problem, what we want to achieve, how we plan to do it, which tools we will use and how the work is shared among the three of us.</w:t>
       </w:r>
     </w:p>
     <w:p>
@@ -786,7 +854,454 @@
         <w:pStyle w:val="Heading2"/>
       </w:pPr>
       <w:r>
-        <w:t>2. Objectives</w:t>
+        <w:t>2. Problem Statement</w:t>
+      </w:r>
+    </w:p>
+    <w:p>
+      <w:pPr>
+        <w:jc w:val="both"/>
+      </w:pPr>
+      <w:r>
+        <w:rPr>
+          <w:rFonts w:cs="Times New Roman"/>
+        </w:rPr>
+        <w:t xml:space="preserve">Kernel functions often stop early when something goes wrong: memory runs out, a device does not answer, a user passes a bad value. These early stops are called </w:t>
+      </w:r>
+      <w:r>
+        <w:rPr>
+          <w:rFonts w:cs="Times New Roman"/>
+          <w:b/>
+        </w:rPr>
+        <w:t>error exits</w:t>
+      </w:r>
+      <w:r>
+        <w:rPr>
+          <w:rFonts w:cs="Times New Roman"/>
+        </w:rPr>
+        <w:t xml:space="preserve"> or </w:t>
+      </w:r>
+      <w:r>
+        <w:rPr>
+          <w:rFonts w:cs="Times New Roman"/>
+          <w:b/>
+        </w:rPr>
+        <w:t>early-exit paths</w:t>
+      </w:r>
+      <w:r>
+        <w:rPr>
+          <w:rFonts w:cs="Times New Roman"/>
+        </w:rPr>
+        <w:t>. On every such exit the function must give back everything it took so far. Programmers usually do this with a ladder of clean-up labels at the end of the function. The example below shows how easy it is to get this wrong: when the third step fails, the code jumps to the wrong label and the memory taken in the second step is never returned.</w:t>
+      </w:r>
+    </w:p>
+    <w:p>
+      <w:pPr>
+        <w:shd w:val="clear" w:color="auto" w:fill="F3F3F1"/>
+        <w:spacing w:after="0" w:line="240" w:lineRule="auto"/>
+        <w:ind w:left="283"/>
+      </w:pPr>
+      <w:r>
+        <w:rPr>
+          <w:rFonts w:ascii="Consolas" w:eastAsia="Consolas" w:hAnsi="Consolas" w:cs="Consolas"/>
+          <w:sz w:val="18"/>
+        </w:rPr>
+        <w:t>static int sensor_setup(void)</w:t>
+      </w:r>
+    </w:p>
+    <w:p>
+      <w:pPr>
+        <w:shd w:val="clear" w:color="auto" w:fill="F3F3F1"/>
+        <w:spacing w:after="0" w:line="240" w:lineRule="auto"/>
+        <w:ind w:left="283"/>
+      </w:pPr>
+      <w:r>
+        <w:rPr>
+          <w:rFonts w:ascii="Consolas" w:eastAsia="Consolas" w:hAnsi="Consolas" w:cs="Consolas"/>
+          <w:sz w:val="18"/>
+        </w:rPr>
+        <w:t>{</w:t>
+      </w:r>
+    </w:p>
+    <w:p>
+      <w:pPr>
+        <w:shd w:val="clear" w:color="auto" w:fill="F3F3F1"/>
+        <w:spacing w:after="0" w:line="240" w:lineRule="auto"/>
+        <w:ind w:left="283"/>
+      </w:pPr>
+      <w:r>
+        <w:rPr>
+          <w:rFonts w:ascii="Consolas" w:eastAsia="Consolas" w:hAnsi="Consolas" w:cs="Consolas"/>
+          <w:sz w:val="18"/>
+        </w:rPr>
+        <w:t xml:space="preserve">        char *rx, *tx, *name;</w:t>
+      </w:r>
+    </w:p>
+    <w:p>
+      <w:pPr>
+        <w:shd w:val="clear" w:color="auto" w:fill="F3F3F1"/>
+        <w:spacing w:after="0" w:line="240" w:lineRule="auto"/>
+        <w:ind w:left="283"/>
+      </w:pPr>
+      <w:r>
+        <w:rPr>
+          <w:rFonts w:ascii="Consolas" w:eastAsia="Consolas" w:hAnsi="Consolas" w:cs="Consolas"/>
+          <w:sz w:val="18"/>
+        </w:rPr>
+        <w:t xml:space="preserve">        int ret;</w:t>
+      </w:r>
+    </w:p>
+    <w:p>
+      <w:pPr>
+        <w:shd w:val="clear" w:color="auto" w:fill="F3F3F1"/>
+        <w:spacing w:after="0" w:line="240" w:lineRule="auto"/>
+        <w:ind w:left="283"/>
+      </w:pPr>
+      <w:r>
+        <w:rPr>
+          <w:rFonts w:ascii="Consolas" w:eastAsia="Consolas" w:hAnsi="Consolas" w:cs="Consolas"/>
+          <w:sz w:val="18"/>
+        </w:rPr>
+        <w:t xml:space="preserve"> </w:t>
+      </w:r>
+    </w:p>
+    <w:p>
+      <w:pPr>
+        <w:shd w:val="clear" w:color="auto" w:fill="F3F3F1"/>
+        <w:spacing w:after="0" w:line="240" w:lineRule="auto"/>
+        <w:ind w:left="283"/>
+      </w:pPr>
+      <w:r>
+        <w:rPr>
+          <w:rFonts w:ascii="Consolas" w:eastAsia="Consolas" w:hAnsi="Consolas" w:cs="Consolas"/>
+          <w:sz w:val="18"/>
+        </w:rPr>
+        <w:t xml:space="preserve">        rx = kmalloc(RX_SIZE, GFP_KERNEL);       /* take memory #1 */</w:t>
+      </w:r>
+    </w:p>
+    <w:p>
+      <w:pPr>
+        <w:shd w:val="clear" w:color="auto" w:fill="F3F3F1"/>
+        <w:spacing w:after="0" w:line="240" w:lineRule="auto"/>
+        <w:ind w:left="283"/>
+      </w:pPr>
+      <w:r>
+        <w:rPr>
+          <w:rFonts w:ascii="Consolas" w:eastAsia="Consolas" w:hAnsi="Consolas" w:cs="Consolas"/>
+          <w:sz w:val="18"/>
+        </w:rPr>
+        <w:t xml:space="preserve">        if (!rx)</w:t>
+      </w:r>
+    </w:p>
+    <w:p>
+      <w:pPr>
+        <w:shd w:val="clear" w:color="auto" w:fill="F3F3F1"/>
+        <w:spacing w:after="0" w:line="240" w:lineRule="auto"/>
+        <w:ind w:left="283"/>
+      </w:pPr>
+      <w:r>
+        <w:rPr>
+          <w:rFonts w:ascii="Consolas" w:eastAsia="Consolas" w:hAnsi="Consolas" w:cs="Consolas"/>
+          <w:sz w:val="18"/>
+        </w:rPr>
+        <w:t xml:space="preserve">                return -ENOMEM;</w:t>
+      </w:r>
+    </w:p>
+    <w:p>
+      <w:pPr>
+        <w:shd w:val="clear" w:color="auto" w:fill="F3F3F1"/>
+        <w:spacing w:after="0" w:line="240" w:lineRule="auto"/>
+        <w:ind w:left="283"/>
+      </w:pPr>
+      <w:r>
+        <w:rPr>
+          <w:rFonts w:ascii="Consolas" w:eastAsia="Consolas" w:hAnsi="Consolas" w:cs="Consolas"/>
+          <w:sz w:val="18"/>
+        </w:rPr>
+        <w:t xml:space="preserve">        tx = kmalloc(TX_SIZE, GFP_KERNEL);       /* take memory #2 */</w:t>
+      </w:r>
+    </w:p>
+    <w:p>
+      <w:pPr>
+        <w:shd w:val="clear" w:color="auto" w:fill="F3F3F1"/>
+        <w:spacing w:after="0" w:line="240" w:lineRule="auto"/>
+        <w:ind w:left="283"/>
+      </w:pPr>
+      <w:r>
+        <w:rPr>
+          <w:rFonts w:ascii="Consolas" w:eastAsia="Consolas" w:hAnsi="Consolas" w:cs="Consolas"/>
+          <w:sz w:val="18"/>
+        </w:rPr>
+        <w:t xml:space="preserve">        if (!tx) {</w:t>
+      </w:r>
+    </w:p>
+    <w:p>
+      <w:pPr>
+        <w:shd w:val="clear" w:color="auto" w:fill="F3F3F1"/>
+        <w:spacing w:after="0" w:line="240" w:lineRule="auto"/>
+        <w:ind w:left="283"/>
+      </w:pPr>
+      <w:r>
+        <w:rPr>
+          <w:rFonts w:ascii="Consolas" w:eastAsia="Consolas" w:hAnsi="Consolas" w:cs="Consolas"/>
+          <w:sz w:val="18"/>
+        </w:rPr>
+        <w:t xml:space="preserve">                ret = -ENOMEM;</w:t>
+      </w:r>
+    </w:p>
+    <w:p>
+      <w:pPr>
+        <w:shd w:val="clear" w:color="auto" w:fill="F3F3F1"/>
+        <w:spacing w:after="0" w:line="240" w:lineRule="auto"/>
+        <w:ind w:left="283"/>
+      </w:pPr>
+      <w:r>
+        <w:rPr>
+          <w:rFonts w:ascii="Consolas" w:eastAsia="Consolas" w:hAnsi="Consolas" w:cs="Consolas"/>
+          <w:sz w:val="18"/>
+        </w:rPr>
+        <w:t xml:space="preserve">                goto err_rx;</w:t>
+      </w:r>
+    </w:p>
+    <w:p>
+      <w:pPr>
+        <w:shd w:val="clear" w:color="auto" w:fill="F3F3F1"/>
+        <w:spacing w:after="0" w:line="240" w:lineRule="auto"/>
+        <w:ind w:left="283"/>
+      </w:pPr>
+      <w:r>
+        <w:rPr>
+          <w:rFonts w:ascii="Consolas" w:eastAsia="Consolas" w:hAnsi="Consolas" w:cs="Consolas"/>
+          <w:sz w:val="18"/>
+        </w:rPr>
+        <w:lastRenderedPageBreak/>
+        <w:t xml:space="preserve">        }</w:t>
+      </w:r>
+    </w:p>
+    <w:p>
+      <w:pPr>
+        <w:shd w:val="clear" w:color="auto" w:fill="F3F3F1"/>
+        <w:spacing w:after="0" w:line="240" w:lineRule="auto"/>
+        <w:ind w:left="283"/>
+      </w:pPr>
+      <w:r>
+        <w:rPr>
+          <w:rFonts w:ascii="Consolas" w:eastAsia="Consolas" w:hAnsi="Consolas" w:cs="Consolas"/>
+          <w:sz w:val="18"/>
+        </w:rPr>
+        <w:t xml:space="preserve">        name = kasprintf(GFP_KERNEL, "sensor%d", 0);</w:t>
+      </w:r>
+    </w:p>
+    <w:p>
+      <w:pPr>
+        <w:shd w:val="clear" w:color="auto" w:fill="F3F3F1"/>
+        <w:spacing w:after="0" w:line="240" w:lineRule="auto"/>
+        <w:ind w:left="283"/>
+      </w:pPr>
+      <w:r>
+        <w:rPr>
+          <w:rFonts w:ascii="Consolas" w:eastAsia="Consolas" w:hAnsi="Consolas" w:cs="Consolas"/>
+          <w:sz w:val="18"/>
+        </w:rPr>
+        <w:t xml:space="preserve">        if (!name) {                             /* something failed ...      */</w:t>
+      </w:r>
+    </w:p>
+    <w:p>
+      <w:pPr>
+        <w:shd w:val="clear" w:color="auto" w:fill="F3F3F1"/>
+        <w:spacing w:after="0" w:line="240" w:lineRule="auto"/>
+        <w:ind w:left="283"/>
+      </w:pPr>
+      <w:r>
+        <w:rPr>
+          <w:rFonts w:ascii="Consolas" w:eastAsia="Consolas" w:hAnsi="Consolas" w:cs="Consolas"/>
+          <w:sz w:val="18"/>
+        </w:rPr>
+        <w:t xml:space="preserve">                ret = -ENOMEM;</w:t>
+      </w:r>
+    </w:p>
+    <w:p>
+      <w:pPr>
+        <w:shd w:val="clear" w:color="auto" w:fill="F3F3F1"/>
+        <w:spacing w:after="0" w:line="240" w:lineRule="auto"/>
+        <w:ind w:left="283"/>
+      </w:pPr>
+      <w:r>
+        <w:rPr>
+          <w:rFonts w:ascii="Consolas" w:eastAsia="Consolas" w:hAnsi="Consolas" w:cs="Consolas"/>
+          <w:sz w:val="18"/>
+        </w:rPr>
+        <w:t xml:space="preserve">                goto err_rx;                     /* BUG: should be err_tx     */</w:t>
+      </w:r>
+    </w:p>
+    <w:p>
+      <w:pPr>
+        <w:shd w:val="clear" w:color="auto" w:fill="F3F3F1"/>
+        <w:spacing w:after="0" w:line="240" w:lineRule="auto"/>
+        <w:ind w:left="283"/>
+      </w:pPr>
+      <w:r>
+        <w:rPr>
+          <w:rFonts w:ascii="Consolas" w:eastAsia="Consolas" w:hAnsi="Consolas" w:cs="Consolas"/>
+          <w:sz w:val="18"/>
+        </w:rPr>
+        <w:t xml:space="preserve">        }</w:t>
+      </w:r>
+    </w:p>
+    <w:p>
+      <w:pPr>
+        <w:shd w:val="clear" w:color="auto" w:fill="F3F3F1"/>
+        <w:spacing w:after="0" w:line="240" w:lineRule="auto"/>
+        <w:ind w:left="283"/>
+      </w:pPr>
+      <w:r>
+        <w:rPr>
+          <w:rFonts w:ascii="Consolas" w:eastAsia="Consolas" w:hAnsi="Consolas" w:cs="Consolas"/>
+          <w:sz w:val="18"/>
+        </w:rPr>
+        <w:t xml:space="preserve">        ...</w:t>
+      </w:r>
+    </w:p>
+    <w:p>
+      <w:pPr>
+        <w:shd w:val="clear" w:color="auto" w:fill="F3F3F1"/>
+        <w:spacing w:after="0" w:line="240" w:lineRule="auto"/>
+        <w:ind w:left="283"/>
+      </w:pPr>
+      <w:r>
+        <w:rPr>
+          <w:rFonts w:ascii="Consolas" w:eastAsia="Consolas" w:hAnsi="Consolas" w:cs="Consolas"/>
+          <w:sz w:val="18"/>
+        </w:rPr>
+        <w:t>err_tx:</w:t>
+      </w:r>
+    </w:p>
+    <w:p>
+      <w:pPr>
+        <w:shd w:val="clear" w:color="auto" w:fill="F3F3F1"/>
+        <w:spacing w:after="0" w:line="240" w:lineRule="auto"/>
+        <w:ind w:left="283"/>
+      </w:pPr>
+      <w:r>
+        <w:rPr>
+          <w:rFonts w:ascii="Consolas" w:eastAsia="Consolas" w:hAnsi="Consolas" w:cs="Consolas"/>
+          <w:sz w:val="18"/>
+        </w:rPr>
+        <w:t xml:space="preserve">        kfree(tx);                               /* give back memory #2 */</w:t>
+      </w:r>
+    </w:p>
+    <w:p>
+      <w:pPr>
+        <w:shd w:val="clear" w:color="auto" w:fill="F3F3F1"/>
+        <w:spacing w:after="0" w:line="240" w:lineRule="auto"/>
+        <w:ind w:left="283"/>
+      </w:pPr>
+      <w:r>
+        <w:rPr>
+          <w:rFonts w:ascii="Consolas" w:eastAsia="Consolas" w:hAnsi="Consolas" w:cs="Consolas"/>
+          <w:sz w:val="18"/>
+        </w:rPr>
+        <w:t>err_rx:</w:t>
+      </w:r>
+    </w:p>
+    <w:p>
+      <w:pPr>
+        <w:shd w:val="clear" w:color="auto" w:fill="F3F3F1"/>
+        <w:spacing w:after="0" w:line="240" w:lineRule="auto"/>
+        <w:ind w:left="283"/>
+      </w:pPr>
+      <w:r>
+        <w:rPr>
+          <w:rFonts w:ascii="Consolas" w:eastAsia="Consolas" w:hAnsi="Consolas" w:cs="Consolas"/>
+          <w:sz w:val="18"/>
+        </w:rPr>
+        <w:t xml:space="preserve">        kfree(rx);                               /* give back memory #1 */</w:t>
+      </w:r>
+    </w:p>
+    <w:p>
+      <w:pPr>
+        <w:shd w:val="clear" w:color="auto" w:fill="F3F3F1"/>
+        <w:spacing w:after="0" w:line="240" w:lineRule="auto"/>
+        <w:ind w:left="283"/>
+      </w:pPr>
+      <w:r>
+        <w:rPr>
+          <w:rFonts w:ascii="Consolas" w:eastAsia="Consolas" w:hAnsi="Consolas" w:cs="Consolas"/>
+          <w:sz w:val="18"/>
+        </w:rPr>
+        <w:t xml:space="preserve">        return ret;</w:t>
+      </w:r>
+    </w:p>
+    <w:p>
+      <w:pPr>
+        <w:shd w:val="clear" w:color="auto" w:fill="F3F3F1"/>
+        <w:spacing w:after="0" w:line="240" w:lineRule="auto"/>
+        <w:ind w:left="283"/>
+      </w:pPr>
+      <w:r>
+        <w:rPr>
+          <w:rFonts w:ascii="Consolas" w:eastAsia="Consolas" w:hAnsi="Consolas" w:cs="Consolas"/>
+          <w:sz w:val="18"/>
+        </w:rPr>
+        <w:t>}</w:t>
+      </w:r>
+    </w:p>
+    <w:p>
+      <w:pPr>
+        <w:spacing w:after="40"/>
+      </w:pPr>
+    </w:p>
+    <w:p>
+      <w:pPr>
+        <w:jc w:val="both"/>
+      </w:pPr>
+      <w:r>
+        <w:rPr>
+          <w:rFonts w:cs="Times New Roman"/>
+        </w:rPr>
+        <w:t>Such bugs are hard to find for three reasons. First, error exits run only when something fails, which almost never happens during normal testing, so the bug can sit in the code for years. Second, the kernel is enormous (tens of millions of lines), so reading it by hand is impossible. Third, existing automatic tools either read the code and produce many false alarms that a person must check one by one, or run the code and only find leaks on the paths they happen to reach.</w:t>
+      </w:r>
+    </w:p>
+    <w:p>
+      <w:pPr>
+        <w:jc w:val="both"/>
+      </w:pPr>
+      <w:r>
+        <w:rPr>
+          <w:rFonts w:cs="Times New Roman"/>
+          <w:b/>
+        </w:rPr>
+        <w:t>Problem statement:</w:t>
+      </w:r>
+      <w:r>
+        <w:rPr>
+          <w:rFonts w:cs="Times New Roman"/>
+        </w:rPr>
+        <w:t xml:space="preserve"> design and build a tool that automatically finds memory leaks on the error exits of Linux kernel code, confirms each suspected leak with evidence from a real running kernel instead of leaving it to a human, and proposes a checked fix.</w:t>
+      </w:r>
+    </w:p>
+    <w:p>
+      <w:pPr>
+        <w:pStyle w:val="Heading2"/>
+      </w:pPr>
+      <w:r>
+        <w:t>3. Motivation</w:t>
+      </w:r>
+    </w:p>
+    <w:p>
+      <w:pPr>
+        <w:jc w:val="both"/>
+      </w:pPr>
+      <w:r>
+        <w:rPr>
+          <w:rFonts w:cs="Times New Roman"/>
+        </w:rPr>
+        <w:t xml:space="preserve">Memory leaks on error exits are one of the most common bug types fixed in the Linux kernel; the research tool MLEE alone reported 120 new ones. Each is small, but together they matter, because the kernel runs on billions of devices that are rarely restarted. We also found the topic a very good fit for an Operating Systems lab: it touches memory management, kernel modules, error handling, virtual machines and the debugging tools built into Linux itself, and it lets us work with real kernel code instead of a </w:t>
+      </w:r>
+      <w:r>
+        <w:rPr>
+          <w:rFonts w:cs="Times New Roman"/>
+        </w:rPr>
+        <w:t>simulation.</w:t>
       </w:r>
     </w:p>
     <w:p>
@@ -799,13 +1314,20 @@
         <w:rPr>
           <w:rFonts w:cs="Times New Roman"/>
         </w:rPr>
-        <w:t>1. </w:t>
-      </w:r>
-      <w:r>
-        <w:rPr>
-          <w:rFonts w:cs="Times New Roman"/>
-        </w:rPr>
-        <w:t>Implement an LLVM-based static analyser (C++) that detects allocations neither freed nor handed over on paths to a function exit, inspired by MLEE (USENIX ATC 2021).</w:t>
+        <w:t>•  </w:t>
+      </w:r>
+      <w:r>
+        <w:rPr>
+          <w:rFonts w:cs="Times New Roman"/>
+          <w:b/>
+        </w:rPr>
+        <w:t xml:space="preserve">Reliability: </w:t>
+      </w:r>
+      <w:r>
+        <w:rPr>
+          <w:rFonts w:cs="Times New Roman"/>
+        </w:rPr>
+        <w:t>servers and phones run for weeks; a slow leak eventually causes out-of-memory failures.</w:t>
       </w:r>
     </w:p>
     <w:p>
@@ -818,13 +1340,20 @@
         <w:rPr>
           <w:rFonts w:cs="Times New Roman"/>
         </w:rPr>
-        <w:t>2. </w:t>
-      </w:r>
-      <w:r>
-        <w:rPr>
-          <w:rFonts w:cs="Times New Roman"/>
-        </w:rPr>
-        <w:t>Identify, for each warning, the failing call that leads onto the leaking path.</w:t>
+        <w:t>•  </w:t>
+      </w:r>
+      <w:r>
+        <w:rPr>
+          <w:rFonts w:cs="Times New Roman"/>
+          <w:b/>
+        </w:rPr>
+        <w:t xml:space="preserve">Security: </w:t>
+      </w:r>
+      <w:r>
+        <w:rPr>
+          <w:rFonts w:cs="Times New Roman"/>
+        </w:rPr>
+        <w:t>a leak that a user can trigger repeatedly can exhaust the kernel's memory (denial of service).</w:t>
       </w:r>
     </w:p>
     <w:p>
@@ -837,13 +1366,20 @@
         <w:rPr>
           <w:rFonts w:cs="Times New Roman"/>
         </w:rPr>
-        <w:t>3. </w:t>
-      </w:r>
-      <w:r>
-        <w:rPr>
-          <w:rFonts w:cs="Times New Roman"/>
-        </w:rPr>
-        <w:t>Build an isolated QEMU/KVM Linux test environment with kmemleak and fault injection.</w:t>
+        <w:t>•  </w:t>
+      </w:r>
+      <w:r>
+        <w:rPr>
+          <w:rFonts w:cs="Times New Roman"/>
+          <w:b/>
+        </w:rPr>
+        <w:t xml:space="preserve">Developer time: </w:t>
+      </w:r>
+      <w:r>
+        <w:rPr>
+          <w:rFonts w:cs="Times New Roman"/>
+        </w:rPr>
+        <w:t>a tool that only says “maybe a leak here” still leaves hours of manual checking; proof attached to each report saves that time.</w:t>
       </w:r>
     </w:p>
     <w:p>
@@ -856,13 +1392,29 @@
         <w:rPr>
           <w:rFonts w:cs="Times New Roman"/>
         </w:rPr>
-        <w:t>4. </w:t>
-      </w:r>
-      <w:r>
-        <w:rPr>
-          <w:rFonts w:cs="Times New Roman"/>
-        </w:rPr>
-        <w:t>Inject the predicted failure automatically and classify each warning as confirmed, not reproduced or inconclusive using kmemleak evidence.</w:t>
+        <w:t>•  </w:t>
+      </w:r>
+      <w:r>
+        <w:rPr>
+          <w:rFonts w:cs="Times New Roman"/>
+          <w:b/>
+        </w:rPr>
+        <w:t xml:space="preserve">Learning: </w:t>
+      </w:r>
+      <w:r>
+        <w:rPr>
+          <w:rFonts w:cs="Times New Roman"/>
+        </w:rPr>
+        <w:t>the project makes us work directly with the kernel's memory allocator, module loading and fault injection — core OS topics.</w:t>
+      </w:r>
+    </w:p>
+    <w:p>
+      <w:pPr>
+        <w:pStyle w:val="Heading2"/>
+      </w:pPr>
+      <w:r>
+        <w:lastRenderedPageBreak/>
+        <w:t>4. Objectives</w:t>
       </w:r>
     </w:p>
     <w:p>
@@ -875,66 +1427,20 @@
         <w:rPr>
           <w:rFonts w:cs="Times New Roman"/>
         </w:rPr>
-        <w:t>5. </w:t>
-      </w:r>
-      <w:r>
-        <w:rPr>
-          <w:rFonts w:cs="Times New Roman"/>
-        </w:rPr>
-        <w:t>Evaluate on a benchmark of kernel modules with ground truth (static vs hybrid vs dynamic-only) and provide a dashboard.</w:t>
-      </w:r>
-    </w:p>
-    <w:p>
-      <w:pPr>
-        <w:pStyle w:val="Heading2"/>
-      </w:pPr>
-      <w:r>
-        <w:t>3. Scope</w:t>
-      </w:r>
-    </w:p>
-    <w:p>
-      <w:pPr>
-        <w:jc w:val="both"/>
-      </w:pPr>
-      <w:r>
-        <w:rPr>
-          <w:rFonts w:cs="Times New Roman"/>
-        </w:rPr>
-        <w:t>In scope: loadable kernel modules compiled with clang for Linux 6.18 LTS; kmalloc, vmalloc, kvmalloc and slab-cache allocations and their release functions; failures injectable with failslab, fail_function and fail_usercopy; a benchmark corpus written by the team. Out of scope: analysis of the complete kernel, non-memory resources, hardware-dependent drivers, and recreating MLEE's full research system.</w:t>
-      </w:r>
-    </w:p>
-    <w:p>
-      <w:pPr>
-        <w:pStyle w:val="Heading2"/>
-      </w:pPr>
-      <w:r>
-        <w:t>4. Literature / Background</w:t>
-      </w:r>
-    </w:p>
-    <w:p>
-      <w:pPr>
-        <w:jc w:val="both"/>
-      </w:pPr>
-      <w:r>
-        <w:rPr>
-          <w:rFonts w:cs="Times New Roman"/>
-        </w:rPr>
-        <w:t xml:space="preserve">MLEE (Wang, 2021) detects missing releases on early-exit paths statically and found 120 new Linux leaks but leaves confirmation to developers. Hector (Saha et al., DSN 2013), K-MELD (Emamdoost et al., NDSS 2021) and HERO (Wu et al., USENIX Security 2021) are further static approaches. FIFUZZ (Jiang et al., USENIX Security 2020) and syzkaller with kmemleak </w:t>
-      </w:r>
-      <w:r>
-        <w:rPr>
-          <w:rFonts w:cs="Times New Roman"/>
-        </w:rPr>
-        <w:lastRenderedPageBreak/>
-        <w:t>execute error paths dynamically but only find leaks on paths they reach and give no static root cause. Linux provides kmemleak (a tracing mark-and-sweep leak detector) and a fault-injection framework (failslab, fail_function, fail_usercopy, per-task fail-nth). The proposed work combines static prediction with targeted fault injection and kmemleak.</w:t>
-      </w:r>
-    </w:p>
-    <w:p>
-      <w:pPr>
-        <w:pStyle w:val="Heading2"/>
-      </w:pPr>
-      <w:r>
-        <w:t>5. Methodology</w:t>
+        <w:t>1. </w:t>
+      </w:r>
+      <w:r>
+        <w:rPr>
+          <w:rFonts w:cs="Times New Roman"/>
+          <w:b/>
+        </w:rPr>
+        <w:t xml:space="preserve">Find: </w:t>
+      </w:r>
+      <w:r>
+        <w:rPr>
+          <w:rFonts w:cs="Times New Roman"/>
+        </w:rPr>
+        <w:t>build a static analyser that reads compiled kernel module code (LLVM IR) and points out memory that is not given back on some error exit, together with the failing call that leads there.</w:t>
       </w:r>
     </w:p>
     <w:p>
@@ -947,20 +1453,20 @@
         <w:rPr>
           <w:rFonts w:cs="Times New Roman"/>
         </w:rPr>
-        <w:t>1. </w:t>
+        <w:t>2. </w:t>
       </w:r>
       <w:r>
         <w:rPr>
           <w:rFonts w:cs="Times New Roman"/>
           <w:b/>
         </w:rPr>
-        <w:t xml:space="preserve">Static analysis: </w:t>
-      </w:r>
-      <w:r>
-        <w:rPr>
-          <w:rFonts w:cs="Times New Roman"/>
-        </w:rPr>
-        <w:t>compile modules to LLVM IR with the exact kbuild flags; track allocations through aliases and stack objects; classify releases and ownership transfers; compute function summaries; search paths from each allocation to every exit, pruning infeasible paths; report exit, error code and trigger calls.</w:t>
+        <w:t xml:space="preserve">Prove: </w:t>
+      </w:r>
+      <w:r>
+        <w:rPr>
+          <w:rFonts w:cs="Times New Roman"/>
+        </w:rPr>
+        <w:t>build a runtime checker that boots our own Linux kernel in a virtual machine, makes exactly that call fail using the kernel's fault-injection feature, and asks the kernel's own leak detector (kmemleak) whether memory was really lost.</w:t>
       </w:r>
     </w:p>
     <w:p>
@@ -973,20 +1479,20 @@
         <w:rPr>
           <w:rFonts w:cs="Times New Roman"/>
         </w:rPr>
-        <w:t>2. </w:t>
+        <w:t>3. </w:t>
       </w:r>
       <w:r>
         <w:rPr>
           <w:rFonts w:cs="Times New Roman"/>
           <w:b/>
         </w:rPr>
-        <w:t xml:space="preserve">Test environment: </w:t>
-      </w:r>
-      <w:r>
-        <w:rPr>
-          <w:rFonts w:cs="Times New Roman"/>
-        </w:rPr>
-        <w:t>custom Linux 6.18.55 kernel with kmemleak and fault injection, booted in QEMU/KVM from a minimal initramfs with a shared folder.</w:t>
+        <w:t xml:space="preserve">Decide: </w:t>
+      </w:r>
+      <w:r>
+        <w:rPr>
+          <w:rFonts w:cs="Times New Roman"/>
+        </w:rPr>
+        <w:t>label every warning as confirmed, not reproduced, or inconclusive, and keep the evidence (kernel messages, stack traces) with it.</w:t>
       </w:r>
     </w:p>
     <w:p>
@@ -999,20 +1505,20 @@
         <w:rPr>
           <w:rFonts w:cs="Times New Roman"/>
         </w:rPr>
-        <w:t>3. </w:t>
+        <w:t>4. </w:t>
       </w:r>
       <w:r>
         <w:rPr>
           <w:rFonts w:cs="Times New Roman"/>
           <w:b/>
         </w:rPr>
-        <w:t xml:space="preserve">Fault-point mapping: </w:t>
-      </w:r>
-      <w:r>
-        <w:rPr>
-          <w:rFonts w:cs="Times New Roman"/>
-        </w:rPr>
-        <w:t>run each routine with fail-nth = 1, 2, 3 ... and map each injected fault to a source line from its stack trace.</w:t>
+        <w:t xml:space="preserve">Fix: </w:t>
+      </w:r>
+      <w:r>
+        <w:rPr>
+          <w:rFonts w:cs="Times New Roman"/>
+        </w:rPr>
+        <w:t>generate a patch for each confirmed leak and check it: it must compile, the warning must disappear and the leak must be gone when tested again.</w:t>
       </w:r>
     </w:p>
     <w:p>
@@ -1025,20 +1531,20 @@
         <w:rPr>
           <w:rFonts w:cs="Times New Roman"/>
         </w:rPr>
-        <w:t>4. </w:t>
+        <w:t>5. </w:t>
       </w:r>
       <w:r>
         <w:rPr>
           <w:rFonts w:cs="Times New Roman"/>
           <w:b/>
         </w:rPr>
-        <w:t xml:space="preserve">Targeted verification: </w:t>
-      </w:r>
-      <w:r>
-        <w:rPr>
-          <w:rFonts w:cs="Times New Roman"/>
-        </w:rPr>
-        <w:t>inject the fault that fails the predicted trigger call, scan kmemleak, attribute leaked objects to allocation sites, decide the verdict.</w:t>
+        <w:t xml:space="preserve">Measure: </w:t>
+      </w:r>
+      <w:r>
+        <w:rPr>
+          <w:rFonts w:cs="Times New Roman"/>
+        </w:rPr>
+        <w:t>build a test set of kernel modules with known leaks and known safe code, and compare our tool with simpler approaches and an existing free tool.</w:t>
       </w:r>
     </w:p>
     <w:p>
@@ -1051,20 +1557,20 @@
         <w:rPr>
           <w:rFonts w:cs="Times New Roman"/>
         </w:rPr>
-        <w:t>5. </w:t>
+        <w:t>6. </w:t>
       </w:r>
       <w:r>
         <w:rPr>
           <w:rFonts w:cs="Times New Roman"/>
           <w:b/>
         </w:rPr>
-        <w:t xml:space="preserve">Evaluation: </w:t>
-      </w:r>
-      <w:r>
-        <w:rPr>
-          <w:rFonts w:cs="Times New Roman"/>
-        </w:rPr>
-        <w:t>precision, recall and cost against ground truth; ablation of analysis features; comparison with dynamic-only baselines.</w:t>
+        <w:t xml:space="preserve">Show: </w:t>
+      </w:r>
+      <w:r>
+        <w:rPr>
+          <w:rFonts w:cs="Times New Roman"/>
+        </w:rPr>
+        <w:t>provide a command-line tool, a web dashboard and clear documentation so that others can use and check the results.</w:t>
       </w:r>
     </w:p>
     <w:p>
@@ -1072,7 +1578,18 @@
         <w:pStyle w:val="Heading2"/>
       </w:pPr>
       <w:r>
-        <w:t>6. Tools / Software</w:t>
+        <w:t>5. Scope</w:t>
+      </w:r>
+    </w:p>
+    <w:p>
+      <w:pPr>
+        <w:jc w:val="both"/>
+      </w:pPr>
+      <w:r>
+        <w:rPr>
+          <w:rFonts w:cs="Times New Roman"/>
+        </w:rPr>
+        <w:t>To keep the project achievable in one semester, we set clear limits.</w:t>
       </w:r>
     </w:p>
     <w:p>
@@ -1086,7 +1603,7 @@
           <w:b/>
           <w:sz w:val="22"/>
         </w:rPr>
-        <w:t>Table 6.1: Tools and software</w:t>
+        <w:t>Table 5.1: Project scope</w:t>
       </w:r>
     </w:p>
     <w:tbl>
@@ -1097,8 +1614,8 @@
         <w:tblLook w:val="04A0" w:firstRow="1" w:lastRow="0" w:firstColumn="1" w:lastColumn="0" w:noHBand="0" w:noVBand="1"/>
       </w:tblPr>
       <w:tblGrid>
-        <w:gridCol w:w="3384"/>
-        <w:gridCol w:w="5632"/>
+        <w:gridCol w:w="4509"/>
+        <w:gridCol w:w="4507"/>
       </w:tblGrid>
       <w:tr>
         <w:trPr>
@@ -1106,7 +1623,7 @@
         </w:trPr>
         <w:tc>
           <w:tcPr>
-            <w:tcW w:w="3402" w:type="dxa"/>
+            <w:tcW w:w="4535" w:type="dxa"/>
             <w:shd w:val="clear" w:color="auto" w:fill="E7E6E1"/>
           </w:tcPr>
           <w:p>
@@ -1119,13 +1636,13 @@
                 <w:b/>
                 <w:sz w:val="20"/>
               </w:rPr>
-              <w:t>Purpose</w:t>
-            </w:r>
-          </w:p>
-        </w:tc>
-        <w:tc>
-          <w:tcPr>
-            <w:tcW w:w="5669" w:type="dxa"/>
+              <w:t>In scope</w:t>
+            </w:r>
+          </w:p>
+        </w:tc>
+        <w:tc>
+          <w:tcPr>
+            <w:tcW w:w="4535" w:type="dxa"/>
             <w:shd w:val="clear" w:color="auto" w:fill="E7E6E1"/>
           </w:tcPr>
           <w:p>
@@ -1138,7 +1655,7 @@
                 <w:b/>
                 <w:sz w:val="20"/>
               </w:rPr>
-              <w:t>Tool</w:t>
+              <w:t>Out of scope</w:t>
             </w:r>
           </w:p>
         </w:tc>
@@ -1149,7 +1666,7 @@
         </w:trPr>
         <w:tc>
           <w:tcPr>
-            <w:tcW w:w="3402" w:type="dxa"/>
+            <w:tcW w:w="4535" w:type="dxa"/>
           </w:tcPr>
           <w:p>
             <w:pPr>
@@ -1160,13 +1677,13 @@
                 <w:rFonts w:cs="Times New Roman"/>
                 <w:sz w:val="20"/>
               </w:rPr>
-              <w:t>Static analysis</w:t>
-            </w:r>
-          </w:p>
-        </w:tc>
-        <w:tc>
-          <w:tcPr>
-            <w:tcW w:w="5669" w:type="dxa"/>
+              <w:t>Memory leaks on error exits of Linux kernel modules (C code)</w:t>
+            </w:r>
+          </w:p>
+        </w:tc>
+        <w:tc>
+          <w:tcPr>
+            <w:tcW w:w="4535" w:type="dxa"/>
           </w:tcPr>
           <w:p>
             <w:pPr>
@@ -1177,7 +1694,7 @@
                 <w:rFonts w:cs="Times New Roman"/>
                 <w:sz w:val="20"/>
               </w:rPr>
-              <w:t>C++17, LLVM/Clang 21</w:t>
+              <w:t>Other bug types (use-after-free, races, deadlocks), except when we happen to find them</w:t>
             </w:r>
           </w:p>
         </w:tc>
@@ -1188,7 +1705,7 @@
         </w:trPr>
         <w:tc>
           <w:tcPr>
-            <w:tcW w:w="3402" w:type="dxa"/>
+            <w:tcW w:w="4535" w:type="dxa"/>
           </w:tcPr>
           <w:p>
             <w:pPr>
@@ -1199,13 +1716,13 @@
                 <w:rFonts w:cs="Times New Roman"/>
                 <w:sz w:val="20"/>
               </w:rPr>
-              <w:t>Kernel and modules</w:t>
-            </w:r>
-          </w:p>
-        </w:tc>
-        <w:tc>
-          <w:tcPr>
-            <w:tcW w:w="5669" w:type="dxa"/>
+              <w:t>Kernel memory functions: kmalloc, kzalloc, vmalloc, kmem_cache, kstrdup and similar</w:t>
+            </w:r>
+          </w:p>
+        </w:tc>
+        <w:tc>
+          <w:tcPr>
+            <w:tcW w:w="4535" w:type="dxa"/>
           </w:tcPr>
           <w:p>
             <w:pPr>
@@ -1216,7 +1733,7 @@
                 <w:rFonts w:cs="Times New Roman"/>
                 <w:sz w:val="20"/>
               </w:rPr>
-              <w:t>Linux 6.18.55 LTS, kbuild, kmemleak, fault injection</w:t>
+              <w:t>Leaks of other resources (file handles, locks, reference counts) in general</w:t>
             </w:r>
           </w:p>
         </w:tc>
@@ -1227,7 +1744,7 @@
         </w:trPr>
         <w:tc>
           <w:tcPr>
-            <w:tcW w:w="3402" w:type="dxa"/>
+            <w:tcW w:w="4535" w:type="dxa"/>
           </w:tcPr>
           <w:p>
             <w:pPr>
@@ -1238,13 +1755,13 @@
                 <w:rFonts w:cs="Times New Roman"/>
                 <w:sz w:val="20"/>
               </w:rPr>
-              <w:t>Isolation</w:t>
-            </w:r>
-          </w:p>
-        </w:tc>
-        <w:tc>
-          <w:tcPr>
-            <w:tcW w:w="5669" w:type="dxa"/>
+              <w:t>Our own test modules and real modules that need no special hardware</w:t>
+            </w:r>
+          </w:p>
+        </w:tc>
+        <w:tc>
+          <w:tcPr>
+            <w:tcW w:w="4535" w:type="dxa"/>
           </w:tcPr>
           <w:p>
             <w:pPr>
@@ -1255,7 +1772,7 @@
                 <w:rFonts w:cs="Times New Roman"/>
                 <w:sz w:val="20"/>
               </w:rPr>
-              <w:t>QEMU with KVM, WSL2 on Windows 11, busybox initramfs</w:t>
+              <w:t>Drivers that need real hardware to load</w:t>
             </w:r>
           </w:p>
         </w:tc>
@@ -1266,7 +1783,7 @@
         </w:trPr>
         <w:tc>
           <w:tcPr>
-            <w:tcW w:w="3402" w:type="dxa"/>
+            <w:tcW w:w="4535" w:type="dxa"/>
           </w:tcPr>
           <w:p>
             <w:pPr>
@@ -1277,13 +1794,13 @@
                 <w:rFonts w:cs="Times New Roman"/>
                 <w:sz w:val="20"/>
               </w:rPr>
-              <w:t>Runtime agent</w:t>
-            </w:r>
-          </w:p>
-        </w:tc>
-        <w:tc>
-          <w:tcPr>
-            <w:tcW w:w="5669" w:type="dxa"/>
+              <w:t>Linux 6.18 running in QEMU on a laptop (WSL2 on Windows)</w:t>
+            </w:r>
+          </w:p>
+        </w:tc>
+        <w:tc>
+          <w:tcPr>
+            <w:tcW w:w="4535" w:type="dxa"/>
           </w:tcPr>
           <w:p>
             <w:pPr>
@@ -1294,7 +1811,7 @@
                 <w:rFonts w:cs="Times New Roman"/>
                 <w:sz w:val="20"/>
               </w:rPr>
-              <w:t>C (statically linked)</w:t>
+              <w:t>Running on physical machines or other operating systems</w:t>
             </w:r>
           </w:p>
         </w:tc>
@@ -1305,7 +1822,7 @@
         </w:trPr>
         <w:tc>
           <w:tcPr>
-            <w:tcW w:w="3402" w:type="dxa"/>
+            <w:tcW w:w="4535" w:type="dxa"/>
           </w:tcPr>
           <w:p>
             <w:pPr>
@@ -1316,13 +1833,13 @@
                 <w:rFonts w:cs="Times New Roman"/>
                 <w:sz w:val="20"/>
               </w:rPr>
-              <w:t>Automation, evaluation, dashboard</w:t>
-            </w:r>
-          </w:p>
-        </w:tc>
-        <w:tc>
-          <w:tcPr>
-            <w:tcW w:w="5669" w:type="dxa"/>
+              <w:t>Error exits reached while a module loads (and test triggers in our modules)</w:t>
+            </w:r>
+          </w:p>
+        </w:tc>
+        <w:tc>
+          <w:tcPr>
+            <w:tcW w:w="4535" w:type="dxa"/>
           </w:tcPr>
           <w:p>
             <w:pPr>
@@ -1333,7 +1850,322 @@
                 <w:rFonts w:cs="Times New Roman"/>
                 <w:sz w:val="20"/>
               </w:rPr>
-              <w:t>Python 3, Streamlit, matplotlib</w:t>
+              <w:t>Code reached only by mounting disks or special system calls (future work)</w:t>
+            </w:r>
+          </w:p>
+        </w:tc>
+      </w:tr>
+    </w:tbl>
+    <w:p>
+      <w:pPr>
+        <w:spacing w:after="80"/>
+      </w:pPr>
+    </w:p>
+    <w:p>
+      <w:pPr>
+        <w:pStyle w:val="Heading2"/>
+      </w:pPr>
+      <w:r>
+        <w:lastRenderedPageBreak/>
+        <w:t>6. Background and Literature Survey</w:t>
+      </w:r>
+    </w:p>
+    <w:p>
+      <w:pPr>
+        <w:pStyle w:val="Heading3"/>
+      </w:pPr>
+      <w:r>
+        <w:t>6.1 Background</w:t>
+      </w:r>
+    </w:p>
+    <w:p>
+      <w:pPr>
+        <w:jc w:val="both"/>
+      </w:pPr>
+      <w:r>
+        <w:rPr>
+          <w:rFonts w:cs="Times New Roman"/>
+          <w:b/>
+        </w:rPr>
+        <w:t>Kernel memory allocation.</w:t>
+      </w:r>
+      <w:r>
+        <w:rPr>
+          <w:rFonts w:cs="Times New Roman"/>
+        </w:rPr>
+        <w:t xml:space="preserve"> Kernel code gets memory from the slab allocator (</w:t>
+      </w:r>
+      <w:r>
+        <w:rPr>
+          <w:rFonts w:ascii="Consolas" w:eastAsia="Consolas" w:hAnsi="Consolas" w:cs="Consolas"/>
+          <w:sz w:val="22"/>
+        </w:rPr>
+        <w:t>kmalloc()</w:t>
+      </w:r>
+      <w:r>
+        <w:rPr>
+          <w:rFonts w:cs="Times New Roman"/>
+        </w:rPr>
+        <w:t xml:space="preserve">, </w:t>
+      </w:r>
+      <w:r>
+        <w:rPr>
+          <w:rFonts w:ascii="Consolas" w:eastAsia="Consolas" w:hAnsi="Consolas" w:cs="Consolas"/>
+          <w:sz w:val="22"/>
+        </w:rPr>
+        <w:t>kzalloc()</w:t>
+      </w:r>
+      <w:r>
+        <w:rPr>
+          <w:rFonts w:cs="Times New Roman"/>
+        </w:rPr>
+        <w:t xml:space="preserve">, </w:t>
+      </w:r>
+      <w:r>
+        <w:rPr>
+          <w:rFonts w:ascii="Consolas" w:eastAsia="Consolas" w:hAnsi="Consolas" w:cs="Consolas"/>
+          <w:sz w:val="22"/>
+        </w:rPr>
+        <w:t>kmem_cache_alloc()</w:t>
+      </w:r>
+      <w:r>
+        <w:rPr>
+          <w:rFonts w:cs="Times New Roman"/>
+        </w:rPr>
+        <w:t xml:space="preserve">) or from </w:t>
+      </w:r>
+      <w:r>
+        <w:rPr>
+          <w:rFonts w:ascii="Consolas" w:eastAsia="Consolas" w:hAnsi="Consolas" w:cs="Consolas"/>
+          <w:sz w:val="22"/>
+        </w:rPr>
+        <w:t>vmalloc()</w:t>
+      </w:r>
+      <w:r>
+        <w:rPr>
+          <w:rFonts w:cs="Times New Roman"/>
+        </w:rPr>
+        <w:t xml:space="preserve"> for large areas, and returns it with </w:t>
+      </w:r>
+      <w:r>
+        <w:rPr>
+          <w:rFonts w:ascii="Consolas" w:eastAsia="Consolas" w:hAnsi="Consolas" w:cs="Consolas"/>
+          <w:sz w:val="22"/>
+        </w:rPr>
+        <w:t>kfree()</w:t>
+      </w:r>
+      <w:r>
+        <w:rPr>
+          <w:rFonts w:cs="Times New Roman"/>
+        </w:rPr>
+        <w:t xml:space="preserve">, </w:t>
+      </w:r>
+      <w:r>
+        <w:rPr>
+          <w:rFonts w:ascii="Consolas" w:eastAsia="Consolas" w:hAnsi="Consolas" w:cs="Consolas"/>
+          <w:sz w:val="22"/>
+        </w:rPr>
+        <w:t>vfree()</w:t>
+      </w:r>
+      <w:r>
+        <w:rPr>
+          <w:rFonts w:cs="Times New Roman"/>
+        </w:rPr>
+        <w:t xml:space="preserve"> or </w:t>
+      </w:r>
+      <w:r>
+        <w:rPr>
+          <w:rFonts w:ascii="Consolas" w:eastAsia="Consolas" w:hAnsi="Consolas" w:cs="Consolas"/>
+          <w:sz w:val="22"/>
+        </w:rPr>
+        <w:t>kmem_cache_free()</w:t>
+      </w:r>
+      <w:r>
+        <w:rPr>
+          <w:rFonts w:cs="Times New Roman"/>
+        </w:rPr>
+        <w:t>. Unlike user programs, there is no automatic clean-up.</w:t>
+      </w:r>
+    </w:p>
+    <w:p>
+      <w:pPr>
+        <w:jc w:val="both"/>
+      </w:pPr>
+      <w:r>
+        <w:rPr>
+          <w:rFonts w:cs="Times New Roman"/>
+          <w:b/>
+        </w:rPr>
+        <w:t>kmemleak.</w:t>
+      </w:r>
+      <w:r>
+        <w:rPr>
+          <w:rFonts w:cs="Times New Roman"/>
+        </w:rPr>
+        <w:t xml:space="preserve"> Linux has a built-in leak detector. It remembers every allocation and, when asked, scans the kernel's memory for pointers to each one. An allocation that nobody points to any more is reported as an “unreferenced object”, together with the call stack that allocated it. This is our source of proof.</w:t>
+      </w:r>
+    </w:p>
+    <w:p>
+      <w:pPr>
+        <w:jc w:val="both"/>
+      </w:pPr>
+      <w:r>
+        <w:rPr>
+          <w:rFonts w:cs="Times New Roman"/>
+          <w:b/>
+        </w:rPr>
+        <w:t>Fault injection.</w:t>
+      </w:r>
+      <w:r>
+        <w:rPr>
+          <w:rFonts w:cs="Times New Roman"/>
+        </w:rPr>
+        <w:t xml:space="preserve"> Linux can deliberately make allocations fail, for testing. The file </w:t>
+      </w:r>
+      <w:r>
+        <w:rPr>
+          <w:rFonts w:ascii="Consolas" w:eastAsia="Consolas" w:hAnsi="Consolas" w:cs="Consolas"/>
+          <w:sz w:val="22"/>
+        </w:rPr>
+        <w:t>/proc/self/fail-nth</w:t>
+      </w:r>
+      <w:r>
+        <w:rPr>
+          <w:rFonts w:cs="Times New Roman"/>
+        </w:rPr>
+        <w:t xml:space="preserve"> lets a program say “make the n-th allocation of my next system call fail”. This lets us steer the kernel onto exactly the error exit we want to test.</w:t>
+      </w:r>
+    </w:p>
+    <w:p>
+      <w:pPr>
+        <w:jc w:val="both"/>
+      </w:pPr>
+      <w:r>
+        <w:rPr>
+          <w:rFonts w:cs="Times New Roman"/>
+          <w:b/>
+        </w:rPr>
+        <w:t>LLVM.</w:t>
+      </w:r>
+      <w:r>
+        <w:rPr>
+          <w:rFonts w:cs="Times New Roman"/>
+        </w:rPr>
+        <w:t xml:space="preserve"> The kernel can be compiled with clang into LLVM IR, a simple, well-defined form of the program that is much easier to analyse than C source. Our analyser works on it.</w:t>
+      </w:r>
+    </w:p>
+    <w:p>
+      <w:pPr>
+        <w:pStyle w:val="Heading3"/>
+      </w:pPr>
+      <w:r>
+        <w:t>6.2 Existing work</w:t>
+      </w:r>
+    </w:p>
+    <w:p>
+      <w:pPr>
+        <w:keepNext/>
+        <w:jc w:val="center"/>
+      </w:pPr>
+      <w:r>
+        <w:rPr>
+          <w:rFonts w:cs="Times New Roman"/>
+          <w:b/>
+          <w:sz w:val="22"/>
+        </w:rPr>
+        <w:t>Table 6.1: Existing approaches</w:t>
+      </w:r>
+    </w:p>
+    <w:tbl>
+      <w:tblPr>
+        <w:tblStyle w:val="TableGrid"/>
+        <w:tblW w:w="0" w:type="auto"/>
+        <w:jc w:val="center"/>
+        <w:tblLook w:val="04A0" w:firstRow="1" w:lastRow="0" w:firstColumn="1" w:lastColumn="0" w:noHBand="0" w:noVBand="1"/>
+      </w:tblPr>
+      <w:tblGrid>
+        <w:gridCol w:w="2030"/>
+        <w:gridCol w:w="1805"/>
+        <w:gridCol w:w="2479"/>
+        <w:gridCol w:w="2702"/>
+      </w:tblGrid>
+      <w:tr>
+        <w:trPr>
+          <w:jc w:val="center"/>
+        </w:trPr>
+        <w:tc>
+          <w:tcPr>
+            <w:tcW w:w="2041" w:type="dxa"/>
+            <w:shd w:val="clear" w:color="auto" w:fill="E7E6E1"/>
+          </w:tcPr>
+          <w:p>
+            <w:pPr>
+              <w:spacing w:after="40" w:line="240" w:lineRule="auto"/>
+            </w:pPr>
+            <w:r>
+              <w:rPr>
+                <w:rFonts w:cs="Times New Roman"/>
+                <w:b/>
+                <w:sz w:val="19"/>
+              </w:rPr>
+              <w:t>Approach</w:t>
+            </w:r>
+          </w:p>
+        </w:tc>
+        <w:tc>
+          <w:tcPr>
+            <w:tcW w:w="1814" w:type="dxa"/>
+            <w:shd w:val="clear" w:color="auto" w:fill="E7E6E1"/>
+          </w:tcPr>
+          <w:p>
+            <w:pPr>
+              <w:spacing w:after="40" w:line="240" w:lineRule="auto"/>
+            </w:pPr>
+            <w:r>
+              <w:rPr>
+                <w:rFonts w:cs="Times New Roman"/>
+                <w:b/>
+                <w:sz w:val="19"/>
+              </w:rPr>
+              <w:t>Example</w:t>
+            </w:r>
+          </w:p>
+        </w:tc>
+        <w:tc>
+          <w:tcPr>
+            <w:tcW w:w="2494" w:type="dxa"/>
+            <w:shd w:val="clear" w:color="auto" w:fill="E7E6E1"/>
+          </w:tcPr>
+          <w:p>
+            <w:pPr>
+              <w:spacing w:after="40" w:line="240" w:lineRule="auto"/>
+            </w:pPr>
+            <w:r>
+              <w:rPr>
+                <w:rFonts w:cs="Times New Roman"/>
+                <w:b/>
+                <w:sz w:val="19"/>
+              </w:rPr>
+              <w:t>Strength</w:t>
+            </w:r>
+          </w:p>
+        </w:tc>
+        <w:tc>
+          <w:tcPr>
+            <w:tcW w:w="2721" w:type="dxa"/>
+            <w:shd w:val="clear" w:color="auto" w:fill="E7E6E1"/>
+          </w:tcPr>
+          <w:p>
+            <w:pPr>
+              <w:spacing w:after="40" w:line="240" w:lineRule="auto"/>
+            </w:pPr>
+            <w:r>
+              <w:rPr>
+                <w:rFonts w:cs="Times New Roman"/>
+                <w:b/>
+                <w:sz w:val="19"/>
+              </w:rPr>
+              <w:t>Weakness</w:t>
             </w:r>
           </w:p>
         </w:tc>
@@ -1344,35 +2176,361 @@
         </w:trPr>
         <w:tc>
           <w:tcPr>
-            <w:tcW w:w="3402" w:type="dxa"/>
-          </w:tcPr>
-          <w:p>
-            <w:pPr>
-              <w:spacing w:after="40" w:line="240" w:lineRule="auto"/>
-            </w:pPr>
-            <w:r>
-              <w:rPr>
-                <w:rFonts w:cs="Times New Roman"/>
-                <w:sz w:val="20"/>
-              </w:rPr>
-              <w:t>Version control</w:t>
-            </w:r>
-          </w:p>
-        </w:tc>
-        <w:tc>
-          <w:tcPr>
-            <w:tcW w:w="5669" w:type="dxa"/>
-          </w:tcPr>
-          <w:p>
-            <w:pPr>
-              <w:spacing w:after="40" w:line="240" w:lineRule="auto"/>
-            </w:pPr>
-            <w:r>
-              <w:rPr>
-                <w:rFonts w:cs="Times New Roman"/>
-                <w:sz w:val="20"/>
-              </w:rPr>
-              <w:t>Git</w:t>
+            <w:tcW w:w="2041" w:type="dxa"/>
+          </w:tcPr>
+          <w:p>
+            <w:pPr>
+              <w:spacing w:after="40" w:line="240" w:lineRule="auto"/>
+            </w:pPr>
+            <w:r>
+              <w:rPr>
+                <w:rFonts w:cs="Times New Roman"/>
+                <w:sz w:val="19"/>
+              </w:rPr>
+              <w:t>Read the code (static analysis)</w:t>
+            </w:r>
+          </w:p>
+        </w:tc>
+        <w:tc>
+          <w:tcPr>
+            <w:tcW w:w="1814" w:type="dxa"/>
+          </w:tcPr>
+          <w:p>
+            <w:pPr>
+              <w:spacing w:after="40" w:line="240" w:lineRule="auto"/>
+            </w:pPr>
+            <w:r>
+              <w:rPr>
+                <w:rFonts w:cs="Times New Roman"/>
+                <w:sz w:val="19"/>
+              </w:rPr>
+              <w:t>MLEE (2021)</w:t>
+            </w:r>
+          </w:p>
+        </w:tc>
+        <w:tc>
+          <w:tcPr>
+            <w:tcW w:w="2494" w:type="dxa"/>
+          </w:tcPr>
+          <w:p>
+            <w:pPr>
+              <w:spacing w:after="40" w:line="240" w:lineRule="auto"/>
+            </w:pPr>
+            <w:r>
+              <w:rPr>
+                <w:rFonts w:cs="Times New Roman"/>
+                <w:sz w:val="19"/>
+              </w:rPr>
+              <w:t>Finds leaks on paths that never run; found 120 real leaks</w:t>
+            </w:r>
+          </w:p>
+        </w:tc>
+        <w:tc>
+          <w:tcPr>
+            <w:tcW w:w="2721" w:type="dxa"/>
+          </w:tcPr>
+          <w:p>
+            <w:pPr>
+              <w:spacing w:after="40" w:line="240" w:lineRule="auto"/>
+            </w:pPr>
+            <w:r>
+              <w:rPr>
+                <w:rFonts w:cs="Times New Roman"/>
+                <w:sz w:val="19"/>
+              </w:rPr>
+              <w:t>Many false alarms; a person must check each warning</w:t>
+            </w:r>
+          </w:p>
+        </w:tc>
+      </w:tr>
+      <w:tr>
+        <w:trPr>
+          <w:jc w:val="center"/>
+        </w:trPr>
+        <w:tc>
+          <w:tcPr>
+            <w:tcW w:w="2041" w:type="dxa"/>
+          </w:tcPr>
+          <w:p>
+            <w:pPr>
+              <w:spacing w:after="40" w:line="240" w:lineRule="auto"/>
+            </w:pPr>
+            <w:r>
+              <w:rPr>
+                <w:rFonts w:cs="Times New Roman"/>
+                <w:sz w:val="19"/>
+              </w:rPr>
+              <w:t>Ownership reasoning</w:t>
+            </w:r>
+          </w:p>
+        </w:tc>
+        <w:tc>
+          <w:tcPr>
+            <w:tcW w:w="1814" w:type="dxa"/>
+          </w:tcPr>
+          <w:p>
+            <w:pPr>
+              <w:spacing w:after="40" w:line="240" w:lineRule="auto"/>
+            </w:pPr>
+            <w:r>
+              <w:rPr>
+                <w:rFonts w:cs="Times New Roman"/>
+                <w:sz w:val="19"/>
+              </w:rPr>
+              <w:t>K-MELD (2021)</w:t>
+            </w:r>
+          </w:p>
+        </w:tc>
+        <w:tc>
+          <w:tcPr>
+            <w:tcW w:w="2494" w:type="dxa"/>
+          </w:tcPr>
+          <w:p>
+            <w:pPr>
+              <w:spacing w:after="40" w:line="240" w:lineRule="auto"/>
+            </w:pPr>
+            <w:r>
+              <w:rPr>
+                <w:rFonts w:cs="Times New Roman"/>
+                <w:sz w:val="19"/>
+              </w:rPr>
+              <w:t>Understands who owns memory</w:t>
+            </w:r>
+          </w:p>
+        </w:tc>
+        <w:tc>
+          <w:tcPr>
+            <w:tcW w:w="2721" w:type="dxa"/>
+          </w:tcPr>
+          <w:p>
+            <w:pPr>
+              <w:spacing w:after="40" w:line="240" w:lineRule="auto"/>
+            </w:pPr>
+            <w:r>
+              <w:rPr>
+                <w:rFonts w:cs="Times New Roman"/>
+                <w:sz w:val="19"/>
+              </w:rPr>
+              <w:t>Static only; no proof</w:t>
+            </w:r>
+          </w:p>
+        </w:tc>
+      </w:tr>
+      <w:tr>
+        <w:trPr>
+          <w:jc w:val="center"/>
+        </w:trPr>
+        <w:tc>
+          <w:tcPr>
+            <w:tcW w:w="2041" w:type="dxa"/>
+          </w:tcPr>
+          <w:p>
+            <w:pPr>
+              <w:spacing w:after="40" w:line="240" w:lineRule="auto"/>
+            </w:pPr>
+            <w:r>
+              <w:rPr>
+                <w:rFonts w:cs="Times New Roman"/>
+                <w:sz w:val="19"/>
+              </w:rPr>
+              <w:t>Pattern checkers</w:t>
+            </w:r>
+          </w:p>
+        </w:tc>
+        <w:tc>
+          <w:tcPr>
+            <w:tcW w:w="1814" w:type="dxa"/>
+          </w:tcPr>
+          <w:p>
+            <w:pPr>
+              <w:spacing w:after="40" w:line="240" w:lineRule="auto"/>
+            </w:pPr>
+            <w:r>
+              <w:rPr>
+                <w:rFonts w:cs="Times New Roman"/>
+                <w:sz w:val="19"/>
+              </w:rPr>
+              <w:t>Coccinelle, Smatch, cppcheck</w:t>
+            </w:r>
+          </w:p>
+        </w:tc>
+        <w:tc>
+          <w:tcPr>
+            <w:tcW w:w="2494" w:type="dxa"/>
+          </w:tcPr>
+          <w:p>
+            <w:pPr>
+              <w:spacing w:after="40" w:line="240" w:lineRule="auto"/>
+            </w:pPr>
+            <w:r>
+              <w:rPr>
+                <w:rFonts w:cs="Times New Roman"/>
+                <w:sz w:val="19"/>
+              </w:rPr>
+              <w:t>Fast, easy to run</w:t>
+            </w:r>
+          </w:p>
+        </w:tc>
+        <w:tc>
+          <w:tcPr>
+            <w:tcW w:w="2721" w:type="dxa"/>
+          </w:tcPr>
+          <w:p>
+            <w:pPr>
+              <w:spacing w:after="40" w:line="240" w:lineRule="auto"/>
+            </w:pPr>
+            <w:r>
+              <w:rPr>
+                <w:rFonts w:cs="Times New Roman"/>
+                <w:sz w:val="19"/>
+              </w:rPr>
+              <w:t>Only find simple patterns; miss leaks that cross functions or branches</w:t>
+            </w:r>
+          </w:p>
+        </w:tc>
+      </w:tr>
+      <w:tr>
+        <w:trPr>
+          <w:jc w:val="center"/>
+        </w:trPr>
+        <w:tc>
+          <w:tcPr>
+            <w:tcW w:w="2041" w:type="dxa"/>
+          </w:tcPr>
+          <w:p>
+            <w:pPr>
+              <w:spacing w:after="40" w:line="240" w:lineRule="auto"/>
+            </w:pPr>
+            <w:r>
+              <w:rPr>
+                <w:rFonts w:cs="Times New Roman"/>
+                <w:sz w:val="19"/>
+              </w:rPr>
+              <w:t>Run the code (fuzzing)</w:t>
+            </w:r>
+          </w:p>
+        </w:tc>
+        <w:tc>
+          <w:tcPr>
+            <w:tcW w:w="1814" w:type="dxa"/>
+          </w:tcPr>
+          <w:p>
+            <w:pPr>
+              <w:spacing w:after="40" w:line="240" w:lineRule="auto"/>
+            </w:pPr>
+            <w:r>
+              <w:rPr>
+                <w:rFonts w:cs="Times New Roman"/>
+                <w:sz w:val="19"/>
+              </w:rPr>
+              <w:t>syzkaller + kmemleak</w:t>
+            </w:r>
+          </w:p>
+        </w:tc>
+        <w:tc>
+          <w:tcPr>
+            <w:tcW w:w="2494" w:type="dxa"/>
+          </w:tcPr>
+          <w:p>
+            <w:pPr>
+              <w:spacing w:after="40" w:line="240" w:lineRule="auto"/>
+            </w:pPr>
+            <w:r>
+              <w:rPr>
+                <w:rFonts w:cs="Times New Roman"/>
+                <w:sz w:val="19"/>
+              </w:rPr>
+              <w:t>Real evidence</w:t>
+            </w:r>
+          </w:p>
+        </w:tc>
+        <w:tc>
+          <w:tcPr>
+            <w:tcW w:w="2721" w:type="dxa"/>
+          </w:tcPr>
+          <w:p>
+            <w:pPr>
+              <w:spacing w:after="40" w:line="240" w:lineRule="auto"/>
+            </w:pPr>
+            <w:r>
+              <w:rPr>
+                <w:rFonts w:cs="Times New Roman"/>
+                <w:sz w:val="19"/>
+              </w:rPr>
+              <w:t>Only finds what it happens to reach; no explanation of the cause</w:t>
+            </w:r>
+          </w:p>
+        </w:tc>
+      </w:tr>
+      <w:tr>
+        <w:trPr>
+          <w:jc w:val="center"/>
+        </w:trPr>
+        <w:tc>
+          <w:tcPr>
+            <w:tcW w:w="2041" w:type="dxa"/>
+          </w:tcPr>
+          <w:p>
+            <w:pPr>
+              <w:spacing w:after="40" w:line="240" w:lineRule="auto"/>
+            </w:pPr>
+            <w:r>
+              <w:rPr>
+                <w:rFonts w:cs="Times New Roman"/>
+                <w:sz w:val="19"/>
+              </w:rPr>
+              <w:t>Fail every allocation</w:t>
+            </w:r>
+          </w:p>
+        </w:tc>
+        <w:tc>
+          <w:tcPr>
+            <w:tcW w:w="1814" w:type="dxa"/>
+          </w:tcPr>
+          <w:p>
+            <w:pPr>
+              <w:spacing w:after="40" w:line="240" w:lineRule="auto"/>
+            </w:pPr>
+            <w:r>
+              <w:rPr>
+                <w:rFonts w:cs="Times New Roman"/>
+                <w:sz w:val="19"/>
+              </w:rPr>
+              <w:t>fail-nth sweeps</w:t>
+            </w:r>
+          </w:p>
+        </w:tc>
+        <w:tc>
+          <w:tcPr>
+            <w:tcW w:w="2494" w:type="dxa"/>
+          </w:tcPr>
+          <w:p>
+            <w:pPr>
+              <w:spacing w:after="40" w:line="240" w:lineRule="auto"/>
+            </w:pPr>
+            <w:r>
+              <w:rPr>
+                <w:rFonts w:cs="Times New Roman"/>
+                <w:sz w:val="19"/>
+              </w:rPr>
+              <w:t>Systematic</w:t>
+            </w:r>
+          </w:p>
+        </w:tc>
+        <w:tc>
+          <w:tcPr>
+            <w:tcW w:w="2721" w:type="dxa"/>
+          </w:tcPr>
+          <w:p>
+            <w:pPr>
+              <w:spacing w:after="40" w:line="240" w:lineRule="auto"/>
+            </w:pPr>
+            <w:r>
+              <w:rPr>
+                <w:rFonts w:cs="Times New Roman"/>
+                <w:sz w:val="19"/>
+              </w:rPr>
+              <w:t>Very many runs; slow</w:t>
             </w:r>
           </w:p>
         </w:tc>
@@ -1385,10 +2543,73 @@
     </w:p>
     <w:p>
       <w:pPr>
+        <w:pStyle w:val="Heading3"/>
+      </w:pPr>
+      <w:r>
+        <w:t>6.3 Gap we address</w:t>
+      </w:r>
+    </w:p>
+    <w:p>
+      <w:pPr>
+        <w:jc w:val="both"/>
+      </w:pPr>
+      <w:r>
+        <w:rPr>
+          <w:rFonts w:cs="Times New Roman"/>
+        </w:rPr>
+        <w:t xml:space="preserve">No existing tool combines the two sides: static tools find candidates but cannot prove them, and dynamic tools prove leaks but cannot aim. Our idea is to let the static analyser </w:t>
+      </w:r>
+      <w:r>
+        <w:rPr>
+          <w:rFonts w:cs="Times New Roman"/>
+          <w:b/>
+        </w:rPr>
+        <w:t>aim</w:t>
+      </w:r>
+      <w:r>
+        <w:rPr>
+          <w:rFonts w:cs="Times New Roman"/>
+        </w:rPr>
+        <w:t xml:space="preserve"> and the running kernel </w:t>
+      </w:r>
+      <w:r>
+        <w:rPr>
+          <w:rFonts w:cs="Times New Roman"/>
+          <w:b/>
+        </w:rPr>
+        <w:t>prove</w:t>
+      </w:r>
+      <w:r>
+        <w:rPr>
+          <w:rFonts w:cs="Times New Roman"/>
+        </w:rPr>
+        <w:t xml:space="preserve">: the analyser says exactly which allocation leaks, on which exit, and </w:t>
+      </w:r>
+      <w:r>
+        <w:rPr>
+          <w:rFonts w:cs="Times New Roman"/>
+        </w:rPr>
+        <w:lastRenderedPageBreak/>
+        <w:t>which failing call leads there; the virtual machine then makes only that call fail and kmemleak gives the verdict.</w:t>
+      </w:r>
+    </w:p>
+    <w:p>
+      <w:pPr>
         <w:pStyle w:val="Heading2"/>
       </w:pPr>
       <w:r>
-        <w:t>7. Work Plan</w:t>
+        <w:t>7. Proposed Method</w:t>
+      </w:r>
+    </w:p>
+    <w:p>
+      <w:pPr>
+        <w:jc w:val="both"/>
+      </w:pPr>
+      <w:r>
+        <w:rPr>
+          <w:rFonts w:cs="Times New Roman"/>
+        </w:rPr>
+        <w:t>KernelLeakGuard works in three stages, shown in the architecture figure below.</w:t>
       </w:r>
     </w:p>
     <w:p>
@@ -1398,11 +2619,1521 @@
       </w:pPr>
       <w:r>
         <w:rPr>
+          <w:noProof/>
+        </w:rPr>
+        <w:drawing>
+          <wp:inline distT="0" distB="0" distL="0" distR="0" wp14:anchorId="3F9BF963" wp14:editId="5DBB2A1F">
+            <wp:extent cx="5580000" cy="2840727"/>
+            <wp:effectExtent l="0" t="0" r="0" b="0"/>
+            <wp:docPr id="9" name="Picture 9"/>
+            <wp:cNvGraphicFramePr>
+              <a:graphicFrameLocks xmlns:a="http://schemas.openxmlformats.org/drawingml/2006/main" noChangeAspect="1"/>
+            </wp:cNvGraphicFramePr>
+            <a:graphic xmlns:a="http://schemas.openxmlformats.org/drawingml/2006/main">
+              <a:graphicData uri="http://schemas.openxmlformats.org/drawingml/2006/picture">
+                <pic:pic xmlns:pic="http://schemas.openxmlformats.org/drawingml/2006/picture">
+                  <pic:nvPicPr>
+                    <pic:cNvPr id="0" name="fig_architecture.png"/>
+                    <pic:cNvPicPr/>
+                  </pic:nvPicPr>
+                  <pic:blipFill>
+                    <a:blip r:embed="rId8"/>
+                    <a:stretch>
+                      <a:fillRect/>
+                    </a:stretch>
+                  </pic:blipFill>
+                  <pic:spPr>
+                    <a:xfrm>
+                      <a:off x="0" y="0"/>
+                      <a:ext cx="5580000" cy="2840727"/>
+                    </a:xfrm>
+                    <a:prstGeom prst="rect">
+                      <a:avLst/>
+                    </a:prstGeom>
+                  </pic:spPr>
+                </pic:pic>
+              </a:graphicData>
+            </a:graphic>
+          </wp:inline>
+        </w:drawing>
+      </w:r>
+    </w:p>
+    <w:p>
+      <w:pPr>
+        <w:jc w:val="center"/>
+      </w:pPr>
+      <w:r>
+        <w:rPr>
           <w:rFonts w:cs="Times New Roman"/>
           <w:b/>
           <w:sz w:val="22"/>
         </w:rPr>
-        <w:t>Table 7.1: Work plan</w:t>
+        <w:t>Figure 7.1: Planned architecture of KernelLeakGuard</w:t>
+      </w:r>
+    </w:p>
+    <w:p>
+      <w:pPr>
+        <w:pStyle w:val="Heading3"/>
+      </w:pPr>
+      <w:r>
+        <w:t>7.1 Stage 1 — Find (static analysis)</w:t>
+      </w:r>
+    </w:p>
+    <w:p>
+      <w:pPr>
+        <w:spacing w:after="60"/>
+        <w:ind w:left="510" w:hanging="340"/>
+        <w:jc w:val="both"/>
+      </w:pPr>
+      <w:r>
+        <w:rPr>
+          <w:rFonts w:cs="Times New Roman"/>
+        </w:rPr>
+        <w:t>•  </w:t>
+      </w:r>
+      <w:r>
+        <w:rPr>
+          <w:rFonts w:cs="Times New Roman"/>
+        </w:rPr>
+        <w:t>Compile each kernel module with clang into LLVM IR, using the kernel's own build flags.</w:t>
+      </w:r>
+    </w:p>
+    <w:p>
+      <w:pPr>
+        <w:spacing w:after="60"/>
+        <w:ind w:left="510" w:hanging="340"/>
+        <w:jc w:val="both"/>
+      </w:pPr>
+      <w:r>
+        <w:rPr>
+          <w:rFonts w:cs="Times New Roman"/>
+        </w:rPr>
+        <w:t>•  </w:t>
+      </w:r>
+      <w:r>
+        <w:rPr>
+          <w:rFonts w:cs="Times New Roman"/>
+        </w:rPr>
+        <w:t>For every memory allocation, follow the pointer through copies, function calls and local structures.</w:t>
+      </w:r>
+    </w:p>
+    <w:p>
+      <w:pPr>
+        <w:spacing w:after="60"/>
+        <w:ind w:left="510" w:hanging="340"/>
+        <w:jc w:val="both"/>
+      </w:pPr>
+      <w:r>
+        <w:rPr>
+          <w:rFonts w:cs="Times New Roman"/>
+        </w:rPr>
+        <w:t>•  </w:t>
+      </w:r>
+      <w:r>
+        <w:rPr>
+          <w:rFonts w:cs="Times New Roman"/>
+        </w:rPr>
+        <w:t>Search every path from the allocation to each return statement. If a path neither frees the memory nor hands it over to someone else (for example by storing it in a global list), report a possible leak.</w:t>
+      </w:r>
+    </w:p>
+    <w:p>
+      <w:pPr>
+        <w:spacing w:after="60"/>
+        <w:ind w:left="510" w:hanging="340"/>
+        <w:jc w:val="both"/>
+      </w:pPr>
+      <w:r>
+        <w:rPr>
+          <w:rFonts w:cs="Times New Roman"/>
+        </w:rPr>
+        <w:t>•  </w:t>
+      </w:r>
+      <w:r>
+        <w:rPr>
+          <w:rFonts w:cs="Times New Roman"/>
+        </w:rPr>
+        <w:t>Remember which call failed on that path (the “trigger”) and the error that is returned.</w:t>
+      </w:r>
+    </w:p>
+    <w:p>
+      <w:pPr>
+        <w:pStyle w:val="Heading3"/>
+      </w:pPr>
+      <w:r>
+        <w:t>7.2 Stage 2 — Prove (runtime verification)</w:t>
+      </w:r>
+    </w:p>
+    <w:p>
+      <w:pPr>
+        <w:spacing w:after="60"/>
+        <w:ind w:left="510" w:hanging="340"/>
+        <w:jc w:val="both"/>
+      </w:pPr>
+      <w:r>
+        <w:rPr>
+          <w:rFonts w:cs="Times New Roman"/>
+        </w:rPr>
+        <w:t>•  </w:t>
+      </w:r>
+      <w:r>
+        <w:rPr>
+          <w:rFonts w:cs="Times New Roman"/>
+        </w:rPr>
+        <w:t>Build our own Linux kernel with kmemleak and fault injection switched on, and boot it in QEMU (a virtual machine), so failures cannot harm the laptop.</w:t>
+      </w:r>
+    </w:p>
+    <w:p>
+      <w:pPr>
+        <w:spacing w:after="60"/>
+        <w:ind w:left="510" w:hanging="340"/>
+        <w:jc w:val="both"/>
+      </w:pPr>
+      <w:r>
+        <w:rPr>
+          <w:rFonts w:cs="Times New Roman"/>
+        </w:rPr>
+        <w:t>•  </w:t>
+      </w:r>
+      <w:r>
+        <w:rPr>
+          <w:rFonts w:cs="Times New Roman"/>
+        </w:rPr>
+        <w:t>Inside the virtual machine, a small agent program loads the module and fails the allocations one by one (1st, 2nd, 3rd, ...) to learn which failure number belongs to which line of code.</w:t>
+      </w:r>
+    </w:p>
+    <w:p>
+      <w:pPr>
+        <w:spacing w:after="60"/>
+        <w:ind w:left="510" w:hanging="340"/>
+        <w:jc w:val="both"/>
+      </w:pPr>
+      <w:r>
+        <w:rPr>
+          <w:rFonts w:cs="Times New Roman"/>
+        </w:rPr>
+        <w:lastRenderedPageBreak/>
+        <w:t>•  </w:t>
+      </w:r>
+      <w:r>
+        <w:rPr>
+          <w:rFonts w:cs="Times New Roman"/>
+        </w:rPr>
+        <w:t>Then it fails exactly the trigger found in stage 1, three times, and asks kmemleak for unreferenced objects.</w:t>
+      </w:r>
+    </w:p>
+    <w:p>
+      <w:pPr>
+        <w:spacing w:after="60"/>
+        <w:ind w:left="510" w:hanging="340"/>
+        <w:jc w:val="both"/>
+      </w:pPr>
+      <w:r>
+        <w:rPr>
+          <w:rFonts w:cs="Times New Roman"/>
+        </w:rPr>
+        <w:t>•  </w:t>
+      </w:r>
+      <w:r>
+        <w:rPr>
+          <w:rFonts w:cs="Times New Roman"/>
+        </w:rPr>
+        <w:t xml:space="preserve">If an object allocated at the reported line is left behind, the warning is </w:t>
+      </w:r>
+      <w:r>
+        <w:rPr>
+          <w:rFonts w:cs="Times New Roman"/>
+          <w:b/>
+        </w:rPr>
+        <w:t>confirmed</w:t>
+      </w:r>
+      <w:r>
+        <w:rPr>
+          <w:rFonts w:cs="Times New Roman"/>
+        </w:rPr>
+        <w:t xml:space="preserve">; if the path ran but nothing leaked, it is </w:t>
+      </w:r>
+      <w:r>
+        <w:rPr>
+          <w:rFonts w:cs="Times New Roman"/>
+          <w:b/>
+        </w:rPr>
+        <w:t>not reproduced</w:t>
+      </w:r>
+      <w:r>
+        <w:rPr>
+          <w:rFonts w:cs="Times New Roman"/>
+        </w:rPr>
+        <w:t xml:space="preserve">; if the failure could not be triggered, it is </w:t>
+      </w:r>
+      <w:r>
+        <w:rPr>
+          <w:rFonts w:cs="Times New Roman"/>
+          <w:b/>
+        </w:rPr>
+        <w:t>inconclusive</w:t>
+      </w:r>
+      <w:r>
+        <w:rPr>
+          <w:rFonts w:cs="Times New Roman"/>
+        </w:rPr>
+        <w:t>.</w:t>
+      </w:r>
+    </w:p>
+    <w:p>
+      <w:pPr>
+        <w:pStyle w:val="Heading3"/>
+      </w:pPr>
+      <w:r>
+        <w:t>7.3 Stage 3 — Fix and report</w:t>
+      </w:r>
+    </w:p>
+    <w:p>
+      <w:pPr>
+        <w:spacing w:after="60"/>
+        <w:ind w:left="510" w:hanging="340"/>
+        <w:jc w:val="both"/>
+      </w:pPr>
+      <w:r>
+        <w:rPr>
+          <w:rFonts w:cs="Times New Roman"/>
+        </w:rPr>
+        <w:t>•  </w:t>
+      </w:r>
+      <w:r>
+        <w:rPr>
+          <w:rFonts w:cs="Times New Roman"/>
+        </w:rPr>
+        <w:t>For a confirmed leak, add the missing free at the right place (usually by re-using an existing clean-up line), compile the module, analyse it again and re-run the test.</w:t>
+      </w:r>
+    </w:p>
+    <w:p>
+      <w:pPr>
+        <w:spacing w:after="60"/>
+        <w:ind w:left="510" w:hanging="340"/>
+        <w:jc w:val="both"/>
+      </w:pPr>
+      <w:r>
+        <w:rPr>
+          <w:rFonts w:cs="Times New Roman"/>
+        </w:rPr>
+        <w:t>•  </w:t>
+      </w:r>
+      <w:r>
+        <w:rPr>
+          <w:rFonts w:cs="Times New Roman"/>
+        </w:rPr>
+        <w:t>Show everything in a command-line report and a web dashboard with the source code, the failing call and the kernel's evidence.</w:t>
+      </w:r>
+    </w:p>
+    <w:p>
+      <w:pPr>
+        <w:keepNext/>
+        <w:jc w:val="center"/>
+      </w:pPr>
+      <w:r>
+        <w:rPr>
+          <w:noProof/>
+        </w:rPr>
+        <w:drawing>
+          <wp:inline distT="0" distB="0" distL="0" distR="0" wp14:anchorId="704BDB53" wp14:editId="2929E6DB">
+            <wp:extent cx="3780000" cy="4669412"/>
+            <wp:effectExtent l="0" t="0" r="0" b="0"/>
+            <wp:docPr id="10" name="Picture 10"/>
+            <wp:cNvGraphicFramePr>
+              <a:graphicFrameLocks xmlns:a="http://schemas.openxmlformats.org/drawingml/2006/main" noChangeAspect="1"/>
+            </wp:cNvGraphicFramePr>
+            <a:graphic xmlns:a="http://schemas.openxmlformats.org/drawingml/2006/main">
+              <a:graphicData uri="http://schemas.openxmlformats.org/drawingml/2006/picture">
+                <pic:pic xmlns:pic="http://schemas.openxmlformats.org/drawingml/2006/picture">
+                  <pic:nvPicPr>
+                    <pic:cNvPr id="0" name="fig_flowchart.png"/>
+                    <pic:cNvPicPr/>
+                  </pic:nvPicPr>
+                  <pic:blipFill>
+                    <a:blip r:embed="rId9"/>
+                    <a:stretch>
+                      <a:fillRect/>
+                    </a:stretch>
+                  </pic:blipFill>
+                  <pic:spPr>
+                    <a:xfrm>
+                      <a:off x="0" y="0"/>
+                      <a:ext cx="3780000" cy="4669412"/>
+                    </a:xfrm>
+                    <a:prstGeom prst="rect">
+                      <a:avLst/>
+                    </a:prstGeom>
+                  </pic:spPr>
+                </pic:pic>
+              </a:graphicData>
+            </a:graphic>
+          </wp:inline>
+        </w:drawing>
+      </w:r>
+    </w:p>
+    <w:p>
+      <w:pPr>
+        <w:jc w:val="center"/>
+      </w:pPr>
+      <w:r>
+        <w:rPr>
+          <w:rFonts w:cs="Times New Roman"/>
+          <w:b/>
+          <w:sz w:val="22"/>
+        </w:rPr>
+        <w:t>Figure 7.2: Planned flow of the runtime verification</w:t>
+      </w:r>
+    </w:p>
+    <w:p>
+      <w:pPr>
+        <w:pStyle w:val="Heading2"/>
+      </w:pPr>
+      <w:r>
+        <w:lastRenderedPageBreak/>
+        <w:t>8. Operating System Concepts Involved</w:t>
+      </w:r>
+    </w:p>
+    <w:p>
+      <w:pPr>
+        <w:keepNext/>
+        <w:jc w:val="center"/>
+      </w:pPr>
+      <w:r>
+        <w:rPr>
+          <w:rFonts w:cs="Times New Roman"/>
+          <w:b/>
+          <w:sz w:val="22"/>
+        </w:rPr>
+        <w:t>Table 8.1: Operating-system concepts</w:t>
+      </w:r>
+    </w:p>
+    <w:tbl>
+      <w:tblPr>
+        <w:tblStyle w:val="TableGrid"/>
+        <w:tblW w:w="0" w:type="auto"/>
+        <w:jc w:val="center"/>
+        <w:tblLook w:val="04A0" w:firstRow="1" w:lastRow="0" w:firstColumn="1" w:lastColumn="0" w:noHBand="0" w:noVBand="1"/>
+      </w:tblPr>
+      <w:tblGrid>
+        <w:gridCol w:w="2372"/>
+        <w:gridCol w:w="6644"/>
+      </w:tblGrid>
+      <w:tr>
+        <w:trPr>
+          <w:jc w:val="center"/>
+        </w:trPr>
+        <w:tc>
+          <w:tcPr>
+            <w:tcW w:w="2381" w:type="dxa"/>
+            <w:shd w:val="clear" w:color="auto" w:fill="E7E6E1"/>
+          </w:tcPr>
+          <w:p>
+            <w:pPr>
+              <w:spacing w:after="40" w:line="240" w:lineRule="auto"/>
+            </w:pPr>
+            <w:r>
+              <w:rPr>
+                <w:rFonts w:cs="Times New Roman"/>
+                <w:b/>
+                <w:sz w:val="20"/>
+              </w:rPr>
+              <w:t>OS concept</w:t>
+            </w:r>
+          </w:p>
+        </w:tc>
+        <w:tc>
+          <w:tcPr>
+            <w:tcW w:w="6690" w:type="dxa"/>
+            <w:shd w:val="clear" w:color="auto" w:fill="E7E6E1"/>
+          </w:tcPr>
+          <w:p>
+            <w:pPr>
+              <w:spacing w:after="40" w:line="240" w:lineRule="auto"/>
+            </w:pPr>
+            <w:r>
+              <w:rPr>
+                <w:rFonts w:cs="Times New Roman"/>
+                <w:b/>
+                <w:sz w:val="20"/>
+              </w:rPr>
+              <w:t>How the project uses it</w:t>
+            </w:r>
+          </w:p>
+        </w:tc>
+      </w:tr>
+      <w:tr>
+        <w:trPr>
+          <w:jc w:val="center"/>
+        </w:trPr>
+        <w:tc>
+          <w:tcPr>
+            <w:tcW w:w="2381" w:type="dxa"/>
+          </w:tcPr>
+          <w:p>
+            <w:pPr>
+              <w:spacing w:after="40" w:line="240" w:lineRule="auto"/>
+            </w:pPr>
+            <w:r>
+              <w:rPr>
+                <w:rFonts w:cs="Times New Roman"/>
+                <w:sz w:val="20"/>
+              </w:rPr>
+              <w:t>Memory management</w:t>
+            </w:r>
+          </w:p>
+        </w:tc>
+        <w:tc>
+          <w:tcPr>
+            <w:tcW w:w="6690" w:type="dxa"/>
+          </w:tcPr>
+          <w:p>
+            <w:pPr>
+              <w:spacing w:after="40" w:line="240" w:lineRule="auto"/>
+            </w:pPr>
+            <w:r>
+              <w:rPr>
+                <w:rFonts w:cs="Times New Roman"/>
+                <w:sz w:val="20"/>
+              </w:rPr>
+              <w:t>Kernel allocators (slab, kmalloc, vmalloc, kmem_cache), freeing memory, and how kmemleak scans memory to find lost objects</w:t>
+            </w:r>
+          </w:p>
+        </w:tc>
+      </w:tr>
+      <w:tr>
+        <w:trPr>
+          <w:jc w:val="center"/>
+        </w:trPr>
+        <w:tc>
+          <w:tcPr>
+            <w:tcW w:w="2381" w:type="dxa"/>
+          </w:tcPr>
+          <w:p>
+            <w:pPr>
+              <w:spacing w:after="40" w:line="240" w:lineRule="auto"/>
+            </w:pPr>
+            <w:r>
+              <w:rPr>
+                <w:rFonts w:cs="Times New Roman"/>
+                <w:sz w:val="20"/>
+              </w:rPr>
+              <w:t>Kernel modules</w:t>
+            </w:r>
+          </w:p>
+        </w:tc>
+        <w:tc>
+          <w:tcPr>
+            <w:tcW w:w="6690" w:type="dxa"/>
+          </w:tcPr>
+          <w:p>
+            <w:pPr>
+              <w:spacing w:after="40" w:line="240" w:lineRule="auto"/>
+            </w:pPr>
+            <w:r>
+              <w:rPr>
+                <w:rFonts w:cs="Times New Roman"/>
+                <w:sz w:val="20"/>
+              </w:rPr>
+              <w:t>Loading and unloading modules (insmod, finit_module), module initialisation and exit code</w:t>
+            </w:r>
+          </w:p>
+        </w:tc>
+      </w:tr>
+      <w:tr>
+        <w:trPr>
+          <w:jc w:val="center"/>
+        </w:trPr>
+        <w:tc>
+          <w:tcPr>
+            <w:tcW w:w="2381" w:type="dxa"/>
+          </w:tcPr>
+          <w:p>
+            <w:pPr>
+              <w:spacing w:after="40" w:line="240" w:lineRule="auto"/>
+            </w:pPr>
+            <w:r>
+              <w:rPr>
+                <w:rFonts w:cs="Times New Roman"/>
+                <w:sz w:val="20"/>
+              </w:rPr>
+              <w:t>Error handling</w:t>
+            </w:r>
+          </w:p>
+        </w:tc>
+        <w:tc>
+          <w:tcPr>
+            <w:tcW w:w="6690" w:type="dxa"/>
+          </w:tcPr>
+          <w:p>
+            <w:pPr>
+              <w:spacing w:after="40" w:line="240" w:lineRule="auto"/>
+            </w:pPr>
+            <w:r>
+              <w:rPr>
+                <w:rFonts w:cs="Times New Roman"/>
+                <w:sz w:val="20"/>
+              </w:rPr>
+              <w:t>Error codes such as -ENOMEM, clean-up ladders with goto, error exits</w:t>
+            </w:r>
+          </w:p>
+        </w:tc>
+      </w:tr>
+      <w:tr>
+        <w:trPr>
+          <w:jc w:val="center"/>
+        </w:trPr>
+        <w:tc>
+          <w:tcPr>
+            <w:tcW w:w="2381" w:type="dxa"/>
+          </w:tcPr>
+          <w:p>
+            <w:pPr>
+              <w:spacing w:after="40" w:line="240" w:lineRule="auto"/>
+            </w:pPr>
+            <w:r>
+              <w:rPr>
+                <w:rFonts w:cs="Times New Roman"/>
+                <w:sz w:val="20"/>
+              </w:rPr>
+              <w:t>Virtualization</w:t>
+            </w:r>
+          </w:p>
+        </w:tc>
+        <w:tc>
+          <w:tcPr>
+            <w:tcW w:w="6690" w:type="dxa"/>
+          </w:tcPr>
+          <w:p>
+            <w:pPr>
+              <w:spacing w:after="40" w:line="240" w:lineRule="auto"/>
+            </w:pPr>
+            <w:r>
+              <w:rPr>
+                <w:rFonts w:cs="Times New Roman"/>
+                <w:sz w:val="20"/>
+              </w:rPr>
+              <w:t>Running a separate Linux kernel in QEMU, sharing files with the host (9p), serial console</w:t>
+            </w:r>
+          </w:p>
+        </w:tc>
+      </w:tr>
+      <w:tr>
+        <w:trPr>
+          <w:jc w:val="center"/>
+        </w:trPr>
+        <w:tc>
+          <w:tcPr>
+            <w:tcW w:w="2381" w:type="dxa"/>
+          </w:tcPr>
+          <w:p>
+            <w:pPr>
+              <w:spacing w:after="40" w:line="240" w:lineRule="auto"/>
+            </w:pPr>
+            <w:r>
+              <w:rPr>
+                <w:rFonts w:cs="Times New Roman"/>
+                <w:sz w:val="20"/>
+              </w:rPr>
+              <w:t>System calls and /proc, debugfs</w:t>
+            </w:r>
+          </w:p>
+        </w:tc>
+        <w:tc>
+          <w:tcPr>
+            <w:tcW w:w="6690" w:type="dxa"/>
+          </w:tcPr>
+          <w:p>
+            <w:pPr>
+              <w:spacing w:after="40" w:line="240" w:lineRule="auto"/>
+            </w:pPr>
+            <w:r>
+              <w:rPr>
+                <w:rFonts w:cs="Times New Roman"/>
+                <w:sz w:val="20"/>
+              </w:rPr>
+              <w:t>fail-nth in /proc, kmemleak and fault-injection controls in debugfs</w:t>
+            </w:r>
+          </w:p>
+        </w:tc>
+      </w:tr>
+      <w:tr>
+        <w:trPr>
+          <w:jc w:val="center"/>
+        </w:trPr>
+        <w:tc>
+          <w:tcPr>
+            <w:tcW w:w="2381" w:type="dxa"/>
+          </w:tcPr>
+          <w:p>
+            <w:pPr>
+              <w:spacing w:after="40" w:line="240" w:lineRule="auto"/>
+            </w:pPr>
+            <w:r>
+              <w:rPr>
+                <w:rFonts w:cs="Times New Roman"/>
+                <w:sz w:val="20"/>
+              </w:rPr>
+              <w:t>Linux system programming</w:t>
+            </w:r>
+          </w:p>
+        </w:tc>
+        <w:tc>
+          <w:tcPr>
+            <w:tcW w:w="6690" w:type="dxa"/>
+          </w:tcPr>
+          <w:p>
+            <w:pPr>
+              <w:spacing w:after="40" w:line="240" w:lineRule="auto"/>
+            </w:pPr>
+            <w:r>
+              <w:rPr>
+                <w:rFonts w:cs="Times New Roman"/>
+                <w:sz w:val="20"/>
+              </w:rPr>
+              <w:t>A C agent that loads modules and drives fault injection; shell scripts for the guest</w:t>
+            </w:r>
+          </w:p>
+        </w:tc>
+      </w:tr>
+      <w:tr>
+        <w:trPr>
+          <w:jc w:val="center"/>
+        </w:trPr>
+        <w:tc>
+          <w:tcPr>
+            <w:tcW w:w="2381" w:type="dxa"/>
+          </w:tcPr>
+          <w:p>
+            <w:pPr>
+              <w:spacing w:after="40" w:line="240" w:lineRule="auto"/>
+            </w:pPr>
+            <w:r>
+              <w:rPr>
+                <w:rFonts w:cs="Times New Roman"/>
+                <w:sz w:val="20"/>
+              </w:rPr>
+              <w:t>Performance analysis</w:t>
+            </w:r>
+          </w:p>
+        </w:tc>
+        <w:tc>
+          <w:tcPr>
+            <w:tcW w:w="6690" w:type="dxa"/>
+          </w:tcPr>
+          <w:p>
+            <w:pPr>
+              <w:spacing w:after="40" w:line="240" w:lineRule="auto"/>
+            </w:pPr>
+            <w:r>
+              <w:rPr>
+                <w:rFonts w:cs="Times New Roman"/>
+                <w:sz w:val="20"/>
+              </w:rPr>
+              <w:t>Counting how many kernel runs each method needs; precision and recall</w:t>
+            </w:r>
+          </w:p>
+        </w:tc>
+      </w:tr>
+    </w:tbl>
+    <w:p>
+      <w:pPr>
+        <w:spacing w:after="80"/>
+      </w:pPr>
+    </w:p>
+    <w:p>
+      <w:pPr>
+        <w:pStyle w:val="Heading2"/>
+      </w:pPr>
+      <w:r>
+        <w:t>9. Tools and Software</w:t>
+      </w:r>
+    </w:p>
+    <w:p>
+      <w:pPr>
+        <w:keepNext/>
+        <w:jc w:val="center"/>
+      </w:pPr>
+      <w:r>
+        <w:rPr>
+          <w:rFonts w:cs="Times New Roman"/>
+          <w:b/>
+          <w:sz w:val="22"/>
+        </w:rPr>
+        <w:t>Table 9.1: Tools and software</w:t>
+      </w:r>
+    </w:p>
+    <w:tbl>
+      <w:tblPr>
+        <w:tblStyle w:val="TableGrid"/>
+        <w:tblW w:w="0" w:type="auto"/>
+        <w:jc w:val="center"/>
+        <w:tblLook w:val="04A0" w:firstRow="1" w:lastRow="0" w:firstColumn="1" w:lastColumn="0" w:noHBand="0" w:noVBand="1"/>
+      </w:tblPr>
+      <w:tblGrid>
+        <w:gridCol w:w="2820"/>
+        <w:gridCol w:w="6196"/>
+      </w:tblGrid>
+      <w:tr>
+        <w:trPr>
+          <w:jc w:val="center"/>
+        </w:trPr>
+        <w:tc>
+          <w:tcPr>
+            <w:tcW w:w="2835" w:type="dxa"/>
+            <w:shd w:val="clear" w:color="auto" w:fill="E7E6E1"/>
+          </w:tcPr>
+          <w:p>
+            <w:pPr>
+              <w:spacing w:after="40" w:line="240" w:lineRule="auto"/>
+            </w:pPr>
+            <w:r>
+              <w:rPr>
+                <w:rFonts w:cs="Times New Roman"/>
+                <w:b/>
+                <w:sz w:val="20"/>
+              </w:rPr>
+              <w:t>Tool</w:t>
+            </w:r>
+          </w:p>
+        </w:tc>
+        <w:tc>
+          <w:tcPr>
+            <w:tcW w:w="6236" w:type="dxa"/>
+            <w:shd w:val="clear" w:color="auto" w:fill="E7E6E1"/>
+          </w:tcPr>
+          <w:p>
+            <w:pPr>
+              <w:spacing w:after="40" w:line="240" w:lineRule="auto"/>
+            </w:pPr>
+            <w:r>
+              <w:rPr>
+                <w:rFonts w:cs="Times New Roman"/>
+                <w:b/>
+                <w:sz w:val="20"/>
+              </w:rPr>
+              <w:t>Purpose</w:t>
+            </w:r>
+          </w:p>
+        </w:tc>
+      </w:tr>
+      <w:tr>
+        <w:trPr>
+          <w:jc w:val="center"/>
+        </w:trPr>
+        <w:tc>
+          <w:tcPr>
+            <w:tcW w:w="2835" w:type="dxa"/>
+          </w:tcPr>
+          <w:p>
+            <w:pPr>
+              <w:spacing w:after="40" w:line="240" w:lineRule="auto"/>
+            </w:pPr>
+            <w:r>
+              <w:rPr>
+                <w:rFonts w:cs="Times New Roman"/>
+                <w:sz w:val="20"/>
+              </w:rPr>
+              <w:t>Linux 6.18 (LTS) source</w:t>
+            </w:r>
+          </w:p>
+        </w:tc>
+        <w:tc>
+          <w:tcPr>
+            <w:tcW w:w="6236" w:type="dxa"/>
+          </w:tcPr>
+          <w:p>
+            <w:pPr>
+              <w:spacing w:after="40" w:line="240" w:lineRule="auto"/>
+            </w:pPr>
+            <w:r>
+              <w:rPr>
+                <w:rFonts w:cs="Times New Roman"/>
+                <w:sz w:val="20"/>
+              </w:rPr>
+              <w:t>The kernel we build, test and analyse</w:t>
+            </w:r>
+          </w:p>
+        </w:tc>
+      </w:tr>
+      <w:tr>
+        <w:trPr>
+          <w:jc w:val="center"/>
+        </w:trPr>
+        <w:tc>
+          <w:tcPr>
+            <w:tcW w:w="2835" w:type="dxa"/>
+          </w:tcPr>
+          <w:p>
+            <w:pPr>
+              <w:spacing w:after="40" w:line="240" w:lineRule="auto"/>
+            </w:pPr>
+            <w:r>
+              <w:rPr>
+                <w:rFonts w:cs="Times New Roman"/>
+                <w:sz w:val="20"/>
+              </w:rPr>
+              <w:t>Clang / LLVM 21</w:t>
+            </w:r>
+          </w:p>
+        </w:tc>
+        <w:tc>
+          <w:tcPr>
+            <w:tcW w:w="6236" w:type="dxa"/>
+          </w:tcPr>
+          <w:p>
+            <w:pPr>
+              <w:spacing w:after="40" w:line="240" w:lineRule="auto"/>
+            </w:pPr>
+            <w:r>
+              <w:rPr>
+                <w:rFonts w:cs="Times New Roman"/>
+                <w:sz w:val="20"/>
+              </w:rPr>
+              <w:t>Compile the kernel and produce LLVM IR; library for our analyser</w:t>
+            </w:r>
+          </w:p>
+        </w:tc>
+      </w:tr>
+      <w:tr>
+        <w:trPr>
+          <w:jc w:val="center"/>
+        </w:trPr>
+        <w:tc>
+          <w:tcPr>
+            <w:tcW w:w="2835" w:type="dxa"/>
+          </w:tcPr>
+          <w:p>
+            <w:pPr>
+              <w:spacing w:after="40" w:line="240" w:lineRule="auto"/>
+            </w:pPr>
+            <w:r>
+              <w:rPr>
+                <w:rFonts w:cs="Times New Roman"/>
+                <w:sz w:val="20"/>
+              </w:rPr>
+              <w:t>C++17</w:t>
+            </w:r>
+          </w:p>
+        </w:tc>
+        <w:tc>
+          <w:tcPr>
+            <w:tcW w:w="6236" w:type="dxa"/>
+          </w:tcPr>
+          <w:p>
+            <w:pPr>
+              <w:spacing w:after="40" w:line="240" w:lineRule="auto"/>
+            </w:pPr>
+            <w:r>
+              <w:rPr>
+                <w:rFonts w:cs="Times New Roman"/>
+                <w:sz w:val="20"/>
+              </w:rPr>
+              <w:t>The static analyser (klg-analyze)</w:t>
+            </w:r>
+          </w:p>
+        </w:tc>
+      </w:tr>
+      <w:tr>
+        <w:trPr>
+          <w:jc w:val="center"/>
+        </w:trPr>
+        <w:tc>
+          <w:tcPr>
+            <w:tcW w:w="2835" w:type="dxa"/>
+          </w:tcPr>
+          <w:p>
+            <w:pPr>
+              <w:spacing w:after="40" w:line="240" w:lineRule="auto"/>
+            </w:pPr>
+            <w:r>
+              <w:rPr>
+                <w:rFonts w:cs="Times New Roman"/>
+                <w:sz w:val="20"/>
+              </w:rPr>
+              <w:t>C</w:t>
+            </w:r>
+          </w:p>
+        </w:tc>
+        <w:tc>
+          <w:tcPr>
+            <w:tcW w:w="6236" w:type="dxa"/>
+          </w:tcPr>
+          <w:p>
+            <w:pPr>
+              <w:spacing w:after="40" w:line="240" w:lineRule="auto"/>
+            </w:pPr>
+            <w:r>
+              <w:rPr>
+                <w:rFonts w:cs="Times New Roman"/>
+                <w:sz w:val="20"/>
+              </w:rPr>
+              <w:t>Test modules and the in-guest agent (klg-agent)</w:t>
+            </w:r>
+          </w:p>
+        </w:tc>
+      </w:tr>
+      <w:tr>
+        <w:trPr>
+          <w:jc w:val="center"/>
+        </w:trPr>
+        <w:tc>
+          <w:tcPr>
+            <w:tcW w:w="2835" w:type="dxa"/>
+          </w:tcPr>
+          <w:p>
+            <w:pPr>
+              <w:spacing w:after="40" w:line="240" w:lineRule="auto"/>
+            </w:pPr>
+            <w:r>
+              <w:rPr>
+                <w:rFonts w:cs="Times New Roman"/>
+                <w:sz w:val="20"/>
+              </w:rPr>
+              <w:t>QEMU 10</w:t>
+            </w:r>
+          </w:p>
+        </w:tc>
+        <w:tc>
+          <w:tcPr>
+            <w:tcW w:w="6236" w:type="dxa"/>
+          </w:tcPr>
+          <w:p>
+            <w:pPr>
+              <w:spacing w:after="40" w:line="240" w:lineRule="auto"/>
+            </w:pPr>
+            <w:r>
+              <w:rPr>
+                <w:rFonts w:cs="Times New Roman"/>
+                <w:sz w:val="20"/>
+              </w:rPr>
+              <w:t>Virtual machine that runs our kernel</w:t>
+            </w:r>
+          </w:p>
+        </w:tc>
+      </w:tr>
+      <w:tr>
+        <w:trPr>
+          <w:jc w:val="center"/>
+        </w:trPr>
+        <w:tc>
+          <w:tcPr>
+            <w:tcW w:w="2835" w:type="dxa"/>
+          </w:tcPr>
+          <w:p>
+            <w:pPr>
+              <w:spacing w:after="40" w:line="240" w:lineRule="auto"/>
+            </w:pPr>
+            <w:r>
+              <w:rPr>
+                <w:rFonts w:cs="Times New Roman"/>
+                <w:sz w:val="20"/>
+              </w:rPr>
+              <w:t>Python 3</w:t>
+            </w:r>
+          </w:p>
+        </w:tc>
+        <w:tc>
+          <w:tcPr>
+            <w:tcW w:w="6236" w:type="dxa"/>
+          </w:tcPr>
+          <w:p>
+            <w:pPr>
+              <w:spacing w:after="40" w:line="240" w:lineRule="auto"/>
+            </w:pPr>
+            <w:r>
+              <w:rPr>
+                <w:rFonts w:cs="Times New Roman"/>
+                <w:sz w:val="20"/>
+              </w:rPr>
+              <w:t>Orchestration, verdicts, evaluation, reports</w:t>
+            </w:r>
+          </w:p>
+        </w:tc>
+      </w:tr>
+      <w:tr>
+        <w:trPr>
+          <w:jc w:val="center"/>
+        </w:trPr>
+        <w:tc>
+          <w:tcPr>
+            <w:tcW w:w="2835" w:type="dxa"/>
+          </w:tcPr>
+          <w:p>
+            <w:pPr>
+              <w:spacing w:after="40" w:line="240" w:lineRule="auto"/>
+            </w:pPr>
+            <w:r>
+              <w:rPr>
+                <w:rFonts w:cs="Times New Roman"/>
+                <w:sz w:val="20"/>
+              </w:rPr>
+              <w:t>Streamlit, pandas, matplotlib</w:t>
+            </w:r>
+          </w:p>
+        </w:tc>
+        <w:tc>
+          <w:tcPr>
+            <w:tcW w:w="6236" w:type="dxa"/>
+          </w:tcPr>
+          <w:p>
+            <w:pPr>
+              <w:spacing w:after="40" w:line="240" w:lineRule="auto"/>
+            </w:pPr>
+            <w:r>
+              <w:rPr>
+                <w:rFonts w:cs="Times New Roman"/>
+                <w:sz w:val="20"/>
+              </w:rPr>
+              <w:t>Web dashboard and charts</w:t>
+            </w:r>
+          </w:p>
+        </w:tc>
+      </w:tr>
+      <w:tr>
+        <w:trPr>
+          <w:jc w:val="center"/>
+        </w:trPr>
+        <w:tc>
+          <w:tcPr>
+            <w:tcW w:w="2835" w:type="dxa"/>
+          </w:tcPr>
+          <w:p>
+            <w:pPr>
+              <w:spacing w:after="40" w:line="240" w:lineRule="auto"/>
+            </w:pPr>
+            <w:r>
+              <w:rPr>
+                <w:rFonts w:cs="Times New Roman"/>
+                <w:sz w:val="20"/>
+              </w:rPr>
+              <w:t>BusyBox</w:t>
+            </w:r>
+          </w:p>
+        </w:tc>
+        <w:tc>
+          <w:tcPr>
+            <w:tcW w:w="6236" w:type="dxa"/>
+          </w:tcPr>
+          <w:p>
+            <w:pPr>
+              <w:spacing w:after="40" w:line="240" w:lineRule="auto"/>
+            </w:pPr>
+            <w:r>
+              <w:rPr>
+                <w:rFonts w:cs="Times New Roman"/>
+                <w:sz w:val="20"/>
+              </w:rPr>
+              <w:t>Tiny root file system inside the virtual machine</w:t>
+            </w:r>
+          </w:p>
+        </w:tc>
+      </w:tr>
+      <w:tr>
+        <w:trPr>
+          <w:jc w:val="center"/>
+        </w:trPr>
+        <w:tc>
+          <w:tcPr>
+            <w:tcW w:w="2835" w:type="dxa"/>
+          </w:tcPr>
+          <w:p>
+            <w:pPr>
+              <w:spacing w:after="40" w:line="240" w:lineRule="auto"/>
+            </w:pPr>
+            <w:r>
+              <w:rPr>
+                <w:rFonts w:cs="Times New Roman"/>
+                <w:sz w:val="20"/>
+              </w:rPr>
+              <w:t>cppcheck</w:t>
+            </w:r>
+          </w:p>
+        </w:tc>
+        <w:tc>
+          <w:tcPr>
+            <w:tcW w:w="6236" w:type="dxa"/>
+          </w:tcPr>
+          <w:p>
+            <w:pPr>
+              <w:spacing w:after="40" w:line="240" w:lineRule="auto"/>
+            </w:pPr>
+            <w:r>
+              <w:rPr>
+                <w:rFonts w:cs="Times New Roman"/>
+                <w:sz w:val="20"/>
+              </w:rPr>
+              <w:t>Existing tool we compare against</w:t>
+            </w:r>
+          </w:p>
+        </w:tc>
+      </w:tr>
+      <w:tr>
+        <w:trPr>
+          <w:jc w:val="center"/>
+        </w:trPr>
+        <w:tc>
+          <w:tcPr>
+            <w:tcW w:w="2835" w:type="dxa"/>
+          </w:tcPr>
+          <w:p>
+            <w:pPr>
+              <w:spacing w:after="40" w:line="240" w:lineRule="auto"/>
+            </w:pPr>
+            <w:r>
+              <w:rPr>
+                <w:rFonts w:cs="Times New Roman"/>
+                <w:sz w:val="20"/>
+              </w:rPr>
+              <w:t>Git</w:t>
+            </w:r>
+          </w:p>
+        </w:tc>
+        <w:tc>
+          <w:tcPr>
+            <w:tcW w:w="6236" w:type="dxa"/>
+          </w:tcPr>
+          <w:p>
+            <w:pPr>
+              <w:spacing w:after="40" w:line="240" w:lineRule="auto"/>
+            </w:pPr>
+            <w:r>
+              <w:rPr>
+                <w:rFonts w:cs="Times New Roman"/>
+                <w:sz w:val="20"/>
+              </w:rPr>
+              <w:t>Version history and backup</w:t>
+            </w:r>
+          </w:p>
+        </w:tc>
+      </w:tr>
+      <w:tr>
+        <w:trPr>
+          <w:jc w:val="center"/>
+        </w:trPr>
+        <w:tc>
+          <w:tcPr>
+            <w:tcW w:w="2835" w:type="dxa"/>
+          </w:tcPr>
+          <w:p>
+            <w:pPr>
+              <w:spacing w:after="40" w:line="240" w:lineRule="auto"/>
+            </w:pPr>
+            <w:r>
+              <w:rPr>
+                <w:rFonts w:cs="Times New Roman"/>
+                <w:sz w:val="20"/>
+              </w:rPr>
+              <w:t>Ubuntu on WSL2 (Windows 11)</w:t>
+            </w:r>
+          </w:p>
+        </w:tc>
+        <w:tc>
+          <w:tcPr>
+            <w:tcW w:w="6236" w:type="dxa"/>
+          </w:tcPr>
+          <w:p>
+            <w:pPr>
+              <w:spacing w:after="40" w:line="240" w:lineRule="auto"/>
+            </w:pPr>
+            <w:r>
+              <w:rPr>
+                <w:rFonts w:cs="Times New Roman"/>
+                <w:sz w:val="20"/>
+              </w:rPr>
+              <w:t>Development machine</w:t>
+            </w:r>
+          </w:p>
+        </w:tc>
+      </w:tr>
+    </w:tbl>
+    <w:p>
+      <w:pPr>
+        <w:spacing w:after="80"/>
+      </w:pPr>
+    </w:p>
+    <w:p>
+      <w:pPr>
+        <w:jc w:val="both"/>
+      </w:pPr>
+      <w:r>
+        <w:rPr>
+          <w:rFonts w:cs="Times New Roman"/>
+          <w:b/>
+        </w:rPr>
+        <w:t>Hardware:</w:t>
+      </w:r>
+      <w:r>
+        <w:rPr>
+          <w:rFonts w:cs="Times New Roman"/>
+        </w:rPr>
+        <w:t xml:space="preserve"> one laptop (8 or more CPU cores, 16 GB RAM, about 10 GB free disk). No special devices are needed.</w:t>
+      </w:r>
+    </w:p>
+    <w:p>
+      <w:pPr>
+        <w:pStyle w:val="Heading2"/>
+      </w:pPr>
+      <w:r>
+        <w:t>10. Evaluation Plan</w:t>
+      </w:r>
+    </w:p>
+    <w:p>
+      <w:pPr>
+        <w:jc w:val="both"/>
+      </w:pPr>
+      <w:r>
+        <w:rPr>
+          <w:rFonts w:cs="Times New Roman"/>
+        </w:rPr>
+        <w:t>To know whether the tool really works, we will write our own set of small kernel modules where we know the right answer: some contain leaks (marked as such in the source) and some contain tricky but correct code that a naive tool would flag. We will then count:</w:t>
+      </w:r>
+    </w:p>
+    <w:p>
+      <w:pPr>
+        <w:spacing w:after="60"/>
+        <w:ind w:left="510" w:hanging="340"/>
+        <w:jc w:val="both"/>
+      </w:pPr>
+      <w:r>
+        <w:rPr>
+          <w:rFonts w:cs="Times New Roman"/>
+        </w:rPr>
+        <w:t>•  </w:t>
+      </w:r>
+      <w:r>
+        <w:rPr>
+          <w:rFonts w:cs="Times New Roman"/>
+          <w:b/>
+        </w:rPr>
+        <w:t xml:space="preserve">True positives: </w:t>
+      </w:r>
+      <w:r>
+        <w:rPr>
+          <w:rFonts w:cs="Times New Roman"/>
+        </w:rPr>
+        <w:t>real leaks the tool reports.</w:t>
+      </w:r>
+    </w:p>
+    <w:p>
+      <w:pPr>
+        <w:spacing w:after="60"/>
+        <w:ind w:left="510" w:hanging="340"/>
+        <w:jc w:val="both"/>
+      </w:pPr>
+      <w:r>
+        <w:rPr>
+          <w:rFonts w:cs="Times New Roman"/>
+        </w:rPr>
+        <w:t>•  </w:t>
+      </w:r>
+      <w:r>
+        <w:rPr>
+          <w:rFonts w:cs="Times New Roman"/>
+          <w:b/>
+        </w:rPr>
+        <w:t xml:space="preserve">False positives: </w:t>
+      </w:r>
+      <w:r>
+        <w:rPr>
+          <w:rFonts w:cs="Times New Roman"/>
+        </w:rPr>
+        <w:t>safe code the tool wrongly reports.</w:t>
+      </w:r>
+    </w:p>
+    <w:p>
+      <w:pPr>
+        <w:spacing w:after="60"/>
+        <w:ind w:left="510" w:hanging="340"/>
+        <w:jc w:val="both"/>
+      </w:pPr>
+      <w:r>
+        <w:rPr>
+          <w:rFonts w:cs="Times New Roman"/>
+        </w:rPr>
+        <w:lastRenderedPageBreak/>
+        <w:t>•  </w:t>
+      </w:r>
+      <w:r>
+        <w:rPr>
+          <w:rFonts w:cs="Times New Roman"/>
+          <w:b/>
+        </w:rPr>
+        <w:t xml:space="preserve">False negatives: </w:t>
+      </w:r>
+      <w:r>
+        <w:rPr>
+          <w:rFonts w:cs="Times New Roman"/>
+        </w:rPr>
+        <w:t>real leaks the tool misses.</w:t>
+      </w:r>
+    </w:p>
+    <w:p>
+      <w:pPr>
+        <w:spacing w:after="60"/>
+        <w:ind w:left="510" w:hanging="340"/>
+        <w:jc w:val="both"/>
+      </w:pPr>
+      <w:r>
+        <w:rPr>
+          <w:rFonts w:cs="Times New Roman"/>
+        </w:rPr>
+        <w:t>•  </w:t>
+      </w:r>
+      <w:r>
+        <w:rPr>
+          <w:rFonts w:cs="Times New Roman"/>
+          <w:b/>
+        </w:rPr>
+        <w:t xml:space="preserve">Precision and recall: </w:t>
+      </w:r>
+      <w:r>
+        <w:rPr>
+          <w:rFonts w:cs="Times New Roman"/>
+        </w:rPr>
+        <w:t>the share of reports that are correct, and the share of leaks that are found.</w:t>
+      </w:r>
+    </w:p>
+    <w:p>
+      <w:pPr>
+        <w:spacing w:after="60"/>
+        <w:ind w:left="510" w:hanging="340"/>
+        <w:jc w:val="both"/>
+      </w:pPr>
+      <w:r>
+        <w:rPr>
+          <w:rFonts w:cs="Times New Roman"/>
+        </w:rPr>
+        <w:t>•  </w:t>
+      </w:r>
+      <w:r>
+        <w:rPr>
+          <w:rFonts w:cs="Times New Roman"/>
+          <w:b/>
+        </w:rPr>
+        <w:t xml:space="preserve">Cost: </w:t>
+      </w:r>
+      <w:r>
+        <w:rPr>
+          <w:rFonts w:cs="Times New Roman"/>
+        </w:rPr>
+        <w:t>how many times the kernel code had to be run.</w:t>
+      </w:r>
+    </w:p>
+    <w:p>
+      <w:pPr>
+        <w:jc w:val="both"/>
+      </w:pPr>
+      <w:r>
+        <w:rPr>
+          <w:rFonts w:cs="Times New Roman"/>
+        </w:rPr>
+        <w:t>We will compare: our static analysis alone, the complete tool, a naive “missing-kfree” check, failing every allocation blindly, random fault injection, and cppcheck. If time allows we will also run the tool on real Linux modules.</w:t>
+      </w:r>
+    </w:p>
+    <w:p>
+      <w:pPr>
+        <w:pStyle w:val="Heading2"/>
+      </w:pPr>
+      <w:r>
+        <w:t>11. Expected Outcomes</w:t>
+      </w:r>
+    </w:p>
+    <w:p>
+      <w:pPr>
+        <w:spacing w:after="60"/>
+        <w:ind w:left="510" w:hanging="340"/>
+        <w:jc w:val="both"/>
+      </w:pPr>
+      <w:r>
+        <w:rPr>
+          <w:rFonts w:cs="Times New Roman"/>
+        </w:rPr>
+        <w:t>•  </w:t>
+      </w:r>
+      <w:r>
+        <w:rPr>
+          <w:rFonts w:cs="Times New Roman"/>
+        </w:rPr>
+        <w:t>A working tool that finds error-exit leaks and proves or refutes each warning.</w:t>
+      </w:r>
+    </w:p>
+    <w:p>
+      <w:pPr>
+        <w:spacing w:after="60"/>
+        <w:ind w:left="510" w:hanging="340"/>
+        <w:jc w:val="both"/>
+      </w:pPr>
+      <w:r>
+        <w:rPr>
+          <w:rFonts w:cs="Times New Roman"/>
+        </w:rPr>
+        <w:t>•  </w:t>
+      </w:r>
+      <w:r>
+        <w:rPr>
+          <w:rFonts w:cs="Times New Roman"/>
+        </w:rPr>
+        <w:t>A benchmark of kernel modules with known answers and a comparison with other methods.</w:t>
+      </w:r>
+    </w:p>
+    <w:p>
+      <w:pPr>
+        <w:spacing w:after="60"/>
+        <w:ind w:left="510" w:hanging="340"/>
+        <w:jc w:val="both"/>
+      </w:pPr>
+      <w:r>
+        <w:rPr>
+          <w:rFonts w:cs="Times New Roman"/>
+        </w:rPr>
+        <w:t>•  </w:t>
+      </w:r>
+      <w:r>
+        <w:rPr>
+          <w:rFonts w:cs="Times New Roman"/>
+        </w:rPr>
+        <w:t>Generated and checked fix patches.</w:t>
+      </w:r>
+    </w:p>
+    <w:p>
+      <w:pPr>
+        <w:spacing w:after="60"/>
+        <w:ind w:left="510" w:hanging="340"/>
+        <w:jc w:val="both"/>
+      </w:pPr>
+      <w:r>
+        <w:rPr>
+          <w:rFonts w:cs="Times New Roman"/>
+        </w:rPr>
+        <w:t>•  </w:t>
+      </w:r>
+      <w:r>
+        <w:rPr>
+          <w:rFonts w:cs="Times New Roman"/>
+        </w:rPr>
+        <w:t>A dashboard, a user manual, a final report and a presentation.</w:t>
+      </w:r>
+    </w:p>
+    <w:p>
+      <w:pPr>
+        <w:pStyle w:val="Heading2"/>
+      </w:pPr>
+      <w:r>
+        <w:t>12. Work Plan</w:t>
+      </w:r>
+    </w:p>
+    <w:p>
+      <w:pPr>
+        <w:keepNext/>
+        <w:jc w:val="center"/>
+      </w:pPr>
+      <w:r>
+        <w:rPr>
+          <w:rFonts w:cs="Times New Roman"/>
+          <w:b/>
+          <w:sz w:val="22"/>
+        </w:rPr>
+        <w:t>Table 12.1: Work plan</w:t>
       </w:r>
     </w:p>
     <w:tbl>
@@ -1414,8 +4145,8 @@
       </w:tblPr>
       <w:tblGrid>
         <w:gridCol w:w="848"/>
-        <w:gridCol w:w="5629"/>
-        <w:gridCol w:w="2539"/>
+        <w:gridCol w:w="5349"/>
+        <w:gridCol w:w="2819"/>
       </w:tblGrid>
       <w:tr>
         <w:trPr>
@@ -1436,13 +4167,13 @@
                 <w:b/>
                 <w:sz w:val="20"/>
               </w:rPr>
-              <w:t>Phase</w:t>
-            </w:r>
-          </w:p>
-        </w:tc>
-        <w:tc>
-          <w:tcPr>
-            <w:tcW w:w="5669" w:type="dxa"/>
+              <w:t>Week</w:t>
+            </w:r>
+          </w:p>
+        </w:tc>
+        <w:tc>
+          <w:tcPr>
+            <w:tcW w:w="5386" w:type="dxa"/>
             <w:shd w:val="clear" w:color="auto" w:fill="E7E6E1"/>
           </w:tcPr>
           <w:p>
@@ -1455,13 +4186,13 @@
                 <w:b/>
                 <w:sz w:val="20"/>
               </w:rPr>
-              <w:t>Activities</w:t>
-            </w:r>
-          </w:p>
-        </w:tc>
-        <w:tc>
-          <w:tcPr>
-            <w:tcW w:w="2551" w:type="dxa"/>
+              <w:t>Work</w:t>
+            </w:r>
+          </w:p>
+        </w:tc>
+        <w:tc>
+          <w:tcPr>
+            <w:tcW w:w="2835" w:type="dxa"/>
             <w:shd w:val="clear" w:color="auto" w:fill="E7E6E1"/>
           </w:tcPr>
           <w:p>
@@ -1474,7 +4205,7 @@
                 <w:b/>
                 <w:sz w:val="20"/>
               </w:rPr>
-              <w:t>Deliverable</w:t>
+              <w:t>Result</w:t>
             </w:r>
           </w:p>
         </w:tc>
@@ -1502,7 +4233,7 @@
         </w:tc>
         <w:tc>
           <w:tcPr>
-            <w:tcW w:w="5669" w:type="dxa"/>
+            <w:tcW w:w="5386" w:type="dxa"/>
           </w:tcPr>
           <w:p>
             <w:pPr>
@@ -1513,13 +4244,13 @@
                 <w:rFonts w:cs="Times New Roman"/>
                 <w:sz w:val="20"/>
               </w:rPr>
-              <w:t>Literature study (MLEE, kmemleak, fault injection); environment setup; kernel build</w:t>
-            </w:r>
-          </w:p>
-        </w:tc>
-        <w:tc>
-          <w:tcPr>
-            <w:tcW w:w="2551" w:type="dxa"/>
+              <w:t>Study kmemleak, fault injection, MLEE; set up WSL2, clang, QEMU</w:t>
+            </w:r>
+          </w:p>
+        </w:tc>
+        <w:tc>
+          <w:tcPr>
+            <w:tcW w:w="2835" w:type="dxa"/>
           </w:tcPr>
           <w:p>
             <w:pPr>
@@ -1530,7 +4261,7 @@
                 <w:rFonts w:cs="Times New Roman"/>
                 <w:sz w:val="20"/>
               </w:rPr>
-              <w:t>Proposal; bootable test VM</w:t>
+              <w:t>Environment ready</w:t>
             </w:r>
           </w:p>
         </w:tc>
@@ -1552,14 +4283,13 @@
                 <w:rFonts w:cs="Times New Roman"/>
                 <w:sz w:val="20"/>
               </w:rPr>
-              <w:lastRenderedPageBreak/>
               <w:t>2</w:t>
             </w:r>
           </w:p>
         </w:tc>
         <w:tc>
           <w:tcPr>
-            <w:tcW w:w="5669" w:type="dxa"/>
+            <w:tcW w:w="5386" w:type="dxa"/>
           </w:tcPr>
           <w:p>
             <w:pPr>
@@ -1570,13 +4300,13 @@
                 <w:rFonts w:cs="Times New Roman"/>
                 <w:sz w:val="20"/>
               </w:rPr>
-              <w:t>Benchmark corpus with ground truth; IR extraction; analyser core (aliases, path search)</w:t>
-            </w:r>
-          </w:p>
-        </w:tc>
-        <w:tc>
-          <w:tcPr>
-            <w:tcW w:w="2551" w:type="dxa"/>
+              <w:t>Build Linux 6.18 with debugging features; boot it in QEMU</w:t>
+            </w:r>
+          </w:p>
+        </w:tc>
+        <w:tc>
+          <w:tcPr>
+            <w:tcW w:w="2835" w:type="dxa"/>
           </w:tcPr>
           <w:p>
             <w:pPr>
@@ -1587,7 +4317,7 @@
                 <w:rFonts w:cs="Times New Roman"/>
                 <w:sz w:val="20"/>
               </w:rPr>
-              <w:t>First static findings</w:t>
+              <w:t>Kernel boots in the VM</w:t>
             </w:r>
           </w:p>
         </w:tc>
@@ -1615,7 +4345,7 @@
         </w:tc>
         <w:tc>
           <w:tcPr>
-            <w:tcW w:w="5669" w:type="dxa"/>
+            <w:tcW w:w="5386" w:type="dxa"/>
           </w:tcPr>
           <w:p>
             <w:pPr>
@@ -1626,13 +4356,13 @@
                 <w:rFonts w:cs="Times New Roman"/>
                 <w:sz w:val="20"/>
               </w:rPr>
-              <w:t>Ownership transfer, summaries, branch correlation; in-guest agent; fault-point sweep</w:t>
-            </w:r>
-          </w:p>
-        </w:tc>
-        <w:tc>
-          <w:tcPr>
-            <w:tcW w:w="2551" w:type="dxa"/>
+              <w:t>Write the benchmark modules and the guest agent</w:t>
+            </w:r>
+          </w:p>
+        </w:tc>
+        <w:tc>
+          <w:tcPr>
+            <w:tcW w:w="2835" w:type="dxa"/>
           </w:tcPr>
           <w:p>
             <w:pPr>
@@ -1643,7 +4373,7 @@
                 <w:rFonts w:cs="Times New Roman"/>
                 <w:sz w:val="20"/>
               </w:rPr>
-              <w:t>Review-I: working prototype (60-70%)</w:t>
+              <w:t>Modules load in the VM</w:t>
             </w:r>
           </w:p>
         </w:tc>
@@ -1671,7 +4401,7 @@
         </w:tc>
         <w:tc>
           <w:tcPr>
-            <w:tcW w:w="5669" w:type="dxa"/>
+            <w:tcW w:w="5386" w:type="dxa"/>
           </w:tcPr>
           <w:p>
             <w:pPr>
@@ -1682,13 +4412,13 @@
                 <w:rFonts w:cs="Times New Roman"/>
                 <w:sz w:val="20"/>
               </w:rPr>
-              <w:t>Targeted verification, kmemleak attribution, verdicts; baselines; dashboard</w:t>
-            </w:r>
-          </w:p>
-        </w:tc>
-        <w:tc>
-          <w:tcPr>
-            <w:tcW w:w="2551" w:type="dxa"/>
+              <w:t>Static analyser: allocations, paths, frees</w:t>
+            </w:r>
+          </w:p>
+        </w:tc>
+        <w:tc>
+          <w:tcPr>
+            <w:tcW w:w="2835" w:type="dxa"/>
           </w:tcPr>
           <w:p>
             <w:pPr>
@@ -1699,7 +4429,7 @@
                 <w:rFonts w:cs="Times New Roman"/>
                 <w:sz w:val="20"/>
               </w:rPr>
-              <w:t>End-to-end pipeline</w:t>
+              <w:t>First warnings</w:t>
             </w:r>
           </w:p>
         </w:tc>
@@ -1727,7 +4457,7 @@
         </w:tc>
         <w:tc>
           <w:tcPr>
-            <w:tcW w:w="5669" w:type="dxa"/>
+            <w:tcW w:w="5386" w:type="dxa"/>
           </w:tcPr>
           <w:p>
             <w:pPr>
@@ -1738,13 +4468,13 @@
                 <w:rFonts w:cs="Times New Roman"/>
                 <w:sz w:val="20"/>
               </w:rPr>
-              <w:t>Evaluation, ablation, repeated runs; report, user manual, presentation</w:t>
-            </w:r>
-          </w:p>
-        </w:tc>
-        <w:tc>
-          <w:tcPr>
-            <w:tcW w:w="2551" w:type="dxa"/>
+              <w:t>Ownership/escape handling, function summaries</w:t>
+            </w:r>
+          </w:p>
+        </w:tc>
+        <w:tc>
+          <w:tcPr>
+            <w:tcW w:w="2835" w:type="dxa"/>
           </w:tcPr>
           <w:p>
             <w:pPr>
@@ -1755,7 +4485,287 @@
                 <w:rFonts w:cs="Times New Roman"/>
                 <w:sz w:val="20"/>
               </w:rPr>
-              <w:t>Review-II, final report and PPT</w:t>
+              <w:t>Fewer false alarms</w:t>
+            </w:r>
+          </w:p>
+        </w:tc>
+      </w:tr>
+      <w:tr>
+        <w:trPr>
+          <w:jc w:val="center"/>
+        </w:trPr>
+        <w:tc>
+          <w:tcPr>
+            <w:tcW w:w="850" w:type="dxa"/>
+          </w:tcPr>
+          <w:p>
+            <w:pPr>
+              <w:spacing w:after="40" w:line="240" w:lineRule="auto"/>
+            </w:pPr>
+            <w:r>
+              <w:rPr>
+                <w:rFonts w:cs="Times New Roman"/>
+                <w:sz w:val="20"/>
+              </w:rPr>
+              <w:t>6</w:t>
+            </w:r>
+          </w:p>
+        </w:tc>
+        <w:tc>
+          <w:tcPr>
+            <w:tcW w:w="5386" w:type="dxa"/>
+          </w:tcPr>
+          <w:p>
+            <w:pPr>
+              <w:spacing w:after="40" w:line="240" w:lineRule="auto"/>
+            </w:pPr>
+            <w:r>
+              <w:rPr>
+                <w:rFonts w:cs="Times New Roman"/>
+                <w:sz w:val="20"/>
+              </w:rPr>
+              <w:t>Fault-point mapping and targeted confirmation</w:t>
+            </w:r>
+          </w:p>
+        </w:tc>
+        <w:tc>
+          <w:tcPr>
+            <w:tcW w:w="2835" w:type="dxa"/>
+          </w:tcPr>
+          <w:p>
+            <w:pPr>
+              <w:spacing w:after="40" w:line="240" w:lineRule="auto"/>
+            </w:pPr>
+            <w:r>
+              <w:rPr>
+                <w:rFonts w:cs="Times New Roman"/>
+                <w:sz w:val="20"/>
+              </w:rPr>
+              <w:t>First confirmed leak</w:t>
+            </w:r>
+          </w:p>
+        </w:tc>
+      </w:tr>
+      <w:tr>
+        <w:trPr>
+          <w:jc w:val="center"/>
+        </w:trPr>
+        <w:tc>
+          <w:tcPr>
+            <w:tcW w:w="850" w:type="dxa"/>
+          </w:tcPr>
+          <w:p>
+            <w:pPr>
+              <w:spacing w:after="40" w:line="240" w:lineRule="auto"/>
+            </w:pPr>
+            <w:r>
+              <w:rPr>
+                <w:rFonts w:cs="Times New Roman"/>
+                <w:sz w:val="20"/>
+              </w:rPr>
+              <w:t>7</w:t>
+            </w:r>
+          </w:p>
+        </w:tc>
+        <w:tc>
+          <w:tcPr>
+            <w:tcW w:w="5386" w:type="dxa"/>
+          </w:tcPr>
+          <w:p>
+            <w:pPr>
+              <w:spacing w:after="40" w:line="240" w:lineRule="auto"/>
+            </w:pPr>
+            <w:r>
+              <w:rPr>
+                <w:rFonts w:cs="Times New Roman"/>
+                <w:sz w:val="20"/>
+              </w:rPr>
+              <w:t>Verdicts, evidence, symbolising stack traces</w:t>
+            </w:r>
+          </w:p>
+        </w:tc>
+        <w:tc>
+          <w:tcPr>
+            <w:tcW w:w="2835" w:type="dxa"/>
+          </w:tcPr>
+          <w:p>
+            <w:pPr>
+              <w:spacing w:after="40" w:line="240" w:lineRule="auto"/>
+            </w:pPr>
+            <w:r>
+              <w:rPr>
+                <w:rFonts w:cs="Times New Roman"/>
+                <w:sz w:val="20"/>
+              </w:rPr>
+              <w:t>Review-I prototype</w:t>
+            </w:r>
+          </w:p>
+        </w:tc>
+      </w:tr>
+      <w:tr>
+        <w:trPr>
+          <w:jc w:val="center"/>
+        </w:trPr>
+        <w:tc>
+          <w:tcPr>
+            <w:tcW w:w="850" w:type="dxa"/>
+          </w:tcPr>
+          <w:p>
+            <w:pPr>
+              <w:spacing w:after="40" w:line="240" w:lineRule="auto"/>
+            </w:pPr>
+            <w:r>
+              <w:rPr>
+                <w:rFonts w:cs="Times New Roman"/>
+                <w:sz w:val="20"/>
+              </w:rPr>
+              <w:t>8</w:t>
+            </w:r>
+          </w:p>
+        </w:tc>
+        <w:tc>
+          <w:tcPr>
+            <w:tcW w:w="5386" w:type="dxa"/>
+          </w:tcPr>
+          <w:p>
+            <w:pPr>
+              <w:spacing w:after="40" w:line="240" w:lineRule="auto"/>
+            </w:pPr>
+            <w:r>
+              <w:rPr>
+                <w:rFonts w:cs="Times New Roman"/>
+                <w:sz w:val="20"/>
+              </w:rPr>
+              <w:t>Baselines (exhaustive, random, cppcheck), metrics</w:t>
+            </w:r>
+          </w:p>
+        </w:tc>
+        <w:tc>
+          <w:tcPr>
+            <w:tcW w:w="2835" w:type="dxa"/>
+          </w:tcPr>
+          <w:p>
+            <w:pPr>
+              <w:spacing w:after="40" w:line="240" w:lineRule="auto"/>
+            </w:pPr>
+            <w:r>
+              <w:rPr>
+                <w:rFonts w:cs="Times New Roman"/>
+                <w:sz w:val="20"/>
+              </w:rPr>
+              <w:t>Comparison tables</w:t>
+            </w:r>
+          </w:p>
+        </w:tc>
+      </w:tr>
+      <w:tr>
+        <w:trPr>
+          <w:jc w:val="center"/>
+        </w:trPr>
+        <w:tc>
+          <w:tcPr>
+            <w:tcW w:w="850" w:type="dxa"/>
+          </w:tcPr>
+          <w:p>
+            <w:pPr>
+              <w:spacing w:after="40" w:line="240" w:lineRule="auto"/>
+            </w:pPr>
+            <w:r>
+              <w:rPr>
+                <w:rFonts w:cs="Times New Roman"/>
+                <w:sz w:val="20"/>
+              </w:rPr>
+              <w:t>9</w:t>
+            </w:r>
+          </w:p>
+        </w:tc>
+        <w:tc>
+          <w:tcPr>
+            <w:tcW w:w="5386" w:type="dxa"/>
+          </w:tcPr>
+          <w:p>
+            <w:pPr>
+              <w:spacing w:after="40" w:line="240" w:lineRule="auto"/>
+            </w:pPr>
+            <w:r>
+              <w:rPr>
+                <w:rFonts w:cs="Times New Roman"/>
+                <w:sz w:val="20"/>
+              </w:rPr>
+              <w:t>Fix patch generation and validation; dashboard</w:t>
+            </w:r>
+          </w:p>
+        </w:tc>
+        <w:tc>
+          <w:tcPr>
+            <w:tcW w:w="2835" w:type="dxa"/>
+          </w:tcPr>
+          <w:p>
+            <w:pPr>
+              <w:spacing w:after="40" w:line="240" w:lineRule="auto"/>
+            </w:pPr>
+            <w:r>
+              <w:rPr>
+                <w:rFonts w:cs="Times New Roman"/>
+                <w:sz w:val="20"/>
+              </w:rPr>
+              <w:t>Patches and dashboard</w:t>
+            </w:r>
+          </w:p>
+        </w:tc>
+      </w:tr>
+      <w:tr>
+        <w:trPr>
+          <w:jc w:val="center"/>
+        </w:trPr>
+        <w:tc>
+          <w:tcPr>
+            <w:tcW w:w="850" w:type="dxa"/>
+          </w:tcPr>
+          <w:p>
+            <w:pPr>
+              <w:spacing w:after="40" w:line="240" w:lineRule="auto"/>
+            </w:pPr>
+            <w:r>
+              <w:rPr>
+                <w:rFonts w:cs="Times New Roman"/>
+                <w:sz w:val="20"/>
+              </w:rPr>
+              <w:t>10</w:t>
+            </w:r>
+          </w:p>
+        </w:tc>
+        <w:tc>
+          <w:tcPr>
+            <w:tcW w:w="5386" w:type="dxa"/>
+          </w:tcPr>
+          <w:p>
+            <w:pPr>
+              <w:spacing w:after="40" w:line="240" w:lineRule="auto"/>
+            </w:pPr>
+            <w:r>
+              <w:rPr>
+                <w:rFonts w:cs="Times New Roman"/>
+                <w:sz w:val="20"/>
+              </w:rPr>
+              <w:t>Real kernel modules; testing; documentation</w:t>
+            </w:r>
+          </w:p>
+        </w:tc>
+        <w:tc>
+          <w:tcPr>
+            <w:tcW w:w="2835" w:type="dxa"/>
+          </w:tcPr>
+          <w:p>
+            <w:pPr>
+              <w:spacing w:after="40" w:line="240" w:lineRule="auto"/>
+            </w:pPr>
+            <w:r>
+              <w:rPr>
+                <w:rFonts w:cs="Times New Roman"/>
+                <w:sz w:val="20"/>
+              </w:rPr>
+              <w:t>Final report, manual, slides</w:t>
             </w:r>
           </w:p>
         </w:tc>
@@ -1768,10 +4778,47 @@
     </w:p>
     <w:p>
       <w:pPr>
+        <w:jc w:val="both"/>
+      </w:pPr>
+      <w:r>
+        <w:rPr>
+          <w:rFonts w:cs="Times New Roman"/>
+        </w:rPr>
+        <w:t xml:space="preserve">Milestones: </w:t>
+      </w:r>
+      <w:r>
+        <w:rPr>
+          <w:rFonts w:cs="Times New Roman"/>
+          <w:b/>
+        </w:rPr>
+        <w:t>Review-I</w:t>
+      </w:r>
+      <w:r>
+        <w:rPr>
+          <w:rFonts w:cs="Times New Roman"/>
+        </w:rPr>
+        <w:t xml:space="preserve"> — the core pipeline runs end to end on the benchmark (about 60–70% complete). </w:t>
+      </w:r>
+      <w:r>
+        <w:rPr>
+          <w:rFonts w:cs="Times New Roman"/>
+          <w:b/>
+        </w:rPr>
+        <w:t>Review-II</w:t>
+      </w:r>
+      <w:r>
+        <w:rPr>
+          <w:rFonts w:cs="Times New Roman"/>
+        </w:rPr>
+        <w:t xml:space="preserve"> — complete tool, evaluation, dashboard and documentation.</w:t>
+      </w:r>
+    </w:p>
+    <w:p>
+      <w:pPr>
         <w:pStyle w:val="Heading2"/>
       </w:pPr>
       <w:r>
-        <w:t>8. Team Member Responsibilities</w:t>
+        <w:t>13. Team Members and Responsibilities</w:t>
       </w:r>
     </w:p>
     <w:p>
@@ -1785,7 +4832,7 @@
           <w:b/>
           <w:sz w:val="22"/>
         </w:rPr>
-        <w:t>Table 8.1: Responsibilities</w:t>
+        <w:t>Table 13.1: Team responsibilities</w:t>
       </w:r>
     </w:p>
     <w:tbl>
@@ -1796,9 +4843,9 @@
         <w:tblLook w:val="04A0" w:firstRow="1" w:lastRow="0" w:firstColumn="1" w:lastColumn="0" w:noHBand="0" w:noVBand="1"/>
       </w:tblPr>
       <w:tblGrid>
-        <w:gridCol w:w="1974"/>
-        <w:gridCol w:w="1414"/>
-        <w:gridCol w:w="5628"/>
+        <w:gridCol w:w="2255"/>
+        <w:gridCol w:w="1582"/>
+        <w:gridCol w:w="5179"/>
       </w:tblGrid>
       <w:tr>
         <w:trPr>
@@ -1806,7 +4853,7 @@
         </w:trPr>
         <w:tc>
           <w:tcPr>
-            <w:tcW w:w="1984" w:type="dxa"/>
+            <w:tcW w:w="2268" w:type="dxa"/>
             <w:shd w:val="clear" w:color="auto" w:fill="E7E6E1"/>
           </w:tcPr>
           <w:p>
@@ -1825,7 +4872,7 @@
         </w:tc>
         <w:tc>
           <w:tcPr>
-            <w:tcW w:w="1417" w:type="dxa"/>
+            <w:tcW w:w="1587" w:type="dxa"/>
             <w:shd w:val="clear" w:color="auto" w:fill="E7E6E1"/>
           </w:tcPr>
           <w:p>
@@ -1838,13 +4885,13 @@
                 <w:b/>
                 <w:sz w:val="20"/>
               </w:rPr>
-              <w:t>Register No.</w:t>
-            </w:r>
-          </w:p>
-        </w:tc>
-        <w:tc>
-          <w:tcPr>
-            <w:tcW w:w="5669" w:type="dxa"/>
+              <w:t>Register no.</w:t>
+            </w:r>
+          </w:p>
+        </w:tc>
+        <w:tc>
+          <w:tcPr>
+            <w:tcW w:w="5216" w:type="dxa"/>
             <w:shd w:val="clear" w:color="auto" w:fill="E7E6E1"/>
           </w:tcPr>
           <w:p>
@@ -1868,7 +4915,7 @@
         </w:trPr>
         <w:tc>
           <w:tcPr>
-            <w:tcW w:w="1984" w:type="dxa"/>
+            <w:tcW w:w="2268" w:type="dxa"/>
           </w:tcPr>
           <w:p>
             <w:pPr>
@@ -1885,7 +4932,7 @@
         </w:tc>
         <w:tc>
           <w:tcPr>
-            <w:tcW w:w="1417" w:type="dxa"/>
+            <w:tcW w:w="1587" w:type="dxa"/>
           </w:tcPr>
           <w:p>
             <w:pPr>
@@ -1902,7 +4949,7 @@
         </w:tc>
         <w:tc>
           <w:tcPr>
-            <w:tcW w:w="5669" w:type="dxa"/>
+            <w:tcW w:w="5216" w:type="dxa"/>
           </w:tcPr>
           <w:p>
             <w:pPr>
@@ -1913,7 +4960,7 @@
                 <w:rFonts w:cs="Times New Roman"/>
                 <w:sz w:val="20"/>
               </w:rPr>
-              <w:t>Static analyser (C++/LLVM): IR preparation, alias and ownership analysis, function summaries, path search, trigger identification</w:t>
+              <w:t>Static analyser in C++/LLVM: allocation tracking, ownership, path search, triggers, fix locations</w:t>
             </w:r>
           </w:p>
         </w:tc>
@@ -1924,7 +4971,7 @@
         </w:trPr>
         <w:tc>
           <w:tcPr>
-            <w:tcW w:w="1984" w:type="dxa"/>
+            <w:tcW w:w="2268" w:type="dxa"/>
           </w:tcPr>
           <w:p>
             <w:pPr>
@@ -1935,13 +4982,14 @@
                 <w:rFonts w:cs="Times New Roman"/>
                 <w:sz w:val="20"/>
               </w:rPr>
+              <w:lastRenderedPageBreak/>
               <w:t>Abhishek Kumar Singh</w:t>
             </w:r>
           </w:p>
         </w:tc>
         <w:tc>
           <w:tcPr>
-            <w:tcW w:w="1417" w:type="dxa"/>
+            <w:tcW w:w="1587" w:type="dxa"/>
           </w:tcPr>
           <w:p>
             <w:pPr>
@@ -1958,7 +5006,7 @@
         </w:tc>
         <w:tc>
           <w:tcPr>
-            <w:tcW w:w="5669" w:type="dxa"/>
+            <w:tcW w:w="5216" w:type="dxa"/>
           </w:tcPr>
           <w:p>
             <w:pPr>
@@ -1969,7 +5017,7 @@
                 <w:rFonts w:cs="Times New Roman"/>
                 <w:sz w:val="20"/>
               </w:rPr>
-              <w:t>Kernel configuration and build, QEMU/KVM environment, klg-agent fault-injection driver, kmemleak protocol</w:t>
+              <w:t>Kernel build, virtual machine, guest init, fault-injection agent, module loading and symbol logging</w:t>
             </w:r>
           </w:p>
         </w:tc>
@@ -1980,7 +5028,7 @@
         </w:trPr>
         <w:tc>
           <w:tcPr>
-            <w:tcW w:w="1984" w:type="dxa"/>
+            <w:tcW w:w="2268" w:type="dxa"/>
           </w:tcPr>
           <w:p>
             <w:pPr>
@@ -1997,7 +5045,7 @@
         </w:tc>
         <w:tc>
           <w:tcPr>
-            <w:tcW w:w="1417" w:type="dxa"/>
+            <w:tcW w:w="1587" w:type="dxa"/>
           </w:tcPr>
           <w:p>
             <w:pPr>
@@ -2014,7 +5062,7 @@
         </w:tc>
         <w:tc>
           <w:tcPr>
-            <w:tcW w:w="5669" w:type="dxa"/>
+            <w:tcW w:w="5216" w:type="dxa"/>
           </w:tcPr>
           <w:p>
             <w:pPr>
@@ -2025,7 +5073,7 @@
                 <w:rFonts w:cs="Times New Roman"/>
                 <w:sz w:val="20"/>
               </w:rPr>
-              <w:t>Benchmark corpus and ground truth, Python orchestrator and verifier, evaluation, dashboard</w:t>
+              <w:t>Benchmark modules and ground truth, Python verifier and verdicts, evaluation and baselines, dashboard</w:t>
             </w:r>
           </w:p>
         </w:tc>
@@ -2036,8 +5084,428 @@
         <w:spacing w:after="80"/>
       </w:pPr>
     </w:p>
+    <w:p>
+      <w:pPr>
+        <w:jc w:val="both"/>
+      </w:pPr>
+      <w:r>
+        <w:rPr>
+          <w:rFonts w:cs="Times New Roman"/>
+        </w:rPr>
+        <w:t xml:space="preserve">All three of us will test, write documentation and prepare the presentation together, and each will be able to explain every part during the reviews. Guide: </w:t>
+      </w:r>
+      <w:r>
+        <w:rPr>
+          <w:rFonts w:cs="Times New Roman"/>
+          <w:b/>
+        </w:rPr>
+        <w:t>Dr. Arivuselvan K, Associate Professor, SCORE</w:t>
+      </w:r>
+      <w:r>
+        <w:rPr>
+          <w:rFonts w:cs="Times New Roman"/>
+        </w:rPr>
+        <w:t>.</w:t>
+      </w:r>
+    </w:p>
+    <w:p>
+      <w:pPr>
+        <w:pStyle w:val="Heading2"/>
+      </w:pPr>
+      <w:r>
+        <w:t>14. Risks and How We Will Handle Them</w:t>
+      </w:r>
+    </w:p>
+    <w:p>
+      <w:pPr>
+        <w:keepNext/>
+        <w:jc w:val="center"/>
+      </w:pPr>
+      <w:r>
+        <w:rPr>
+          <w:rFonts w:cs="Times New Roman"/>
+          <w:b/>
+          <w:sz w:val="22"/>
+        </w:rPr>
+        <w:t>Table 14.1: Risks</w:t>
+      </w:r>
+    </w:p>
+    <w:tbl>
+      <w:tblPr>
+        <w:tblStyle w:val="TableGrid"/>
+        <w:tblW w:w="0" w:type="auto"/>
+        <w:jc w:val="center"/>
+        <w:tblLook w:val="04A0" w:firstRow="1" w:lastRow="0" w:firstColumn="1" w:lastColumn="0" w:noHBand="0" w:noVBand="1"/>
+      </w:tblPr>
+      <w:tblGrid>
+        <w:gridCol w:w="3383"/>
+        <w:gridCol w:w="5633"/>
+      </w:tblGrid>
+      <w:tr>
+        <w:trPr>
+          <w:jc w:val="center"/>
+        </w:trPr>
+        <w:tc>
+          <w:tcPr>
+            <w:tcW w:w="3402" w:type="dxa"/>
+            <w:shd w:val="clear" w:color="auto" w:fill="E7E6E1"/>
+          </w:tcPr>
+          <w:p>
+            <w:pPr>
+              <w:spacing w:after="40" w:line="240" w:lineRule="auto"/>
+            </w:pPr>
+            <w:r>
+              <w:rPr>
+                <w:rFonts w:cs="Times New Roman"/>
+                <w:b/>
+                <w:sz w:val="20"/>
+              </w:rPr>
+              <w:t>Risk</w:t>
+            </w:r>
+          </w:p>
+        </w:tc>
+        <w:tc>
+          <w:tcPr>
+            <w:tcW w:w="5669" w:type="dxa"/>
+            <w:shd w:val="clear" w:color="auto" w:fill="E7E6E1"/>
+          </w:tcPr>
+          <w:p>
+            <w:pPr>
+              <w:spacing w:after="40" w:line="240" w:lineRule="auto"/>
+            </w:pPr>
+            <w:r>
+              <w:rPr>
+                <w:rFonts w:cs="Times New Roman"/>
+                <w:b/>
+                <w:sz w:val="20"/>
+              </w:rPr>
+              <w:t>What we will do</w:t>
+            </w:r>
+          </w:p>
+        </w:tc>
+      </w:tr>
+      <w:tr>
+        <w:trPr>
+          <w:jc w:val="center"/>
+        </w:trPr>
+        <w:tc>
+          <w:tcPr>
+            <w:tcW w:w="3402" w:type="dxa"/>
+          </w:tcPr>
+          <w:p>
+            <w:pPr>
+              <w:spacing w:after="40" w:line="240" w:lineRule="auto"/>
+            </w:pPr>
+            <w:r>
+              <w:rPr>
+                <w:rFonts w:cs="Times New Roman"/>
+                <w:sz w:val="20"/>
+              </w:rPr>
+              <w:t>Kernel crashes while we inject failures</w:t>
+            </w:r>
+          </w:p>
+        </w:tc>
+        <w:tc>
+          <w:tcPr>
+            <w:tcW w:w="5669" w:type="dxa"/>
+          </w:tcPr>
+          <w:p>
+            <w:pPr>
+              <w:spacing w:after="40" w:line="240" w:lineRule="auto"/>
+            </w:pPr>
+            <w:r>
+              <w:rPr>
+                <w:rFonts w:cs="Times New Roman"/>
+                <w:sz w:val="20"/>
+              </w:rPr>
+              <w:t>Run everything in a virtual machine; detect crashes and restart automatically</w:t>
+            </w:r>
+          </w:p>
+        </w:tc>
+      </w:tr>
+      <w:tr>
+        <w:trPr>
+          <w:jc w:val="center"/>
+        </w:trPr>
+        <w:tc>
+          <w:tcPr>
+            <w:tcW w:w="3402" w:type="dxa"/>
+          </w:tcPr>
+          <w:p>
+            <w:pPr>
+              <w:spacing w:after="40" w:line="240" w:lineRule="auto"/>
+            </w:pPr>
+            <w:r>
+              <w:rPr>
+                <w:rFonts w:cs="Times New Roman"/>
+                <w:sz w:val="20"/>
+              </w:rPr>
+              <w:t>Too many false alarms from the analyser</w:t>
+            </w:r>
+          </w:p>
+        </w:tc>
+        <w:tc>
+          <w:tcPr>
+            <w:tcW w:w="5669" w:type="dxa"/>
+          </w:tcPr>
+          <w:p>
+            <w:pPr>
+              <w:spacing w:after="40" w:line="240" w:lineRule="auto"/>
+            </w:pPr>
+            <w:r>
+              <w:rPr>
+                <w:rFonts w:cs="Times New Roman"/>
+                <w:sz w:val="20"/>
+              </w:rPr>
+              <w:t>Model ownership hand-over and error codes; let the runtime stage refute the rest</w:t>
+            </w:r>
+          </w:p>
+        </w:tc>
+      </w:tr>
+      <w:tr>
+        <w:trPr>
+          <w:jc w:val="center"/>
+        </w:trPr>
+        <w:tc>
+          <w:tcPr>
+            <w:tcW w:w="3402" w:type="dxa"/>
+          </w:tcPr>
+          <w:p>
+            <w:pPr>
+              <w:spacing w:after="40" w:line="240" w:lineRule="auto"/>
+            </w:pPr>
+            <w:r>
+              <w:rPr>
+                <w:rFonts w:cs="Times New Roman"/>
+                <w:sz w:val="20"/>
+              </w:rPr>
+              <w:t>kmemleak misses a leak</w:t>
+            </w:r>
+          </w:p>
+        </w:tc>
+        <w:tc>
+          <w:tcPr>
+            <w:tcW w:w="5669" w:type="dxa"/>
+          </w:tcPr>
+          <w:p>
+            <w:pPr>
+              <w:spacing w:after="40" w:line="240" w:lineRule="auto"/>
+            </w:pPr>
+            <w:r>
+              <w:rPr>
+                <w:rFonts w:cs="Times New Roman"/>
+                <w:sz w:val="20"/>
+              </w:rPr>
+              <w:t>Repeat each test and clear stale memory (zeroing, stack erasing) so leaks are not hidden</w:t>
+            </w:r>
+          </w:p>
+        </w:tc>
+      </w:tr>
+      <w:tr>
+        <w:trPr>
+          <w:jc w:val="center"/>
+        </w:trPr>
+        <w:tc>
+          <w:tcPr>
+            <w:tcW w:w="3402" w:type="dxa"/>
+          </w:tcPr>
+          <w:p>
+            <w:pPr>
+              <w:spacing w:after="40" w:line="240" w:lineRule="auto"/>
+            </w:pPr>
+            <w:r>
+              <w:rPr>
+                <w:rFonts w:cs="Times New Roman"/>
+                <w:sz w:val="20"/>
+              </w:rPr>
+              <w:t>The virtual machine is slow</w:t>
+            </w:r>
+          </w:p>
+        </w:tc>
+        <w:tc>
+          <w:tcPr>
+            <w:tcW w:w="5669" w:type="dxa"/>
+          </w:tcPr>
+          <w:p>
+            <w:pPr>
+              <w:spacing w:after="40" w:line="240" w:lineRule="auto"/>
+            </w:pPr>
+            <w:r>
+              <w:rPr>
+                <w:rFonts w:cs="Times New Roman"/>
+                <w:sz w:val="20"/>
+              </w:rPr>
+              <w:t>Use KVM acceleration when available; only fail the calls the analyser points at</w:t>
+            </w:r>
+          </w:p>
+        </w:tc>
+      </w:tr>
+      <w:tr>
+        <w:trPr>
+          <w:jc w:val="center"/>
+        </w:trPr>
+        <w:tc>
+          <w:tcPr>
+            <w:tcW w:w="3402" w:type="dxa"/>
+          </w:tcPr>
+          <w:p>
+            <w:pPr>
+              <w:spacing w:after="40" w:line="240" w:lineRule="auto"/>
+            </w:pPr>
+            <w:r>
+              <w:rPr>
+                <w:rFonts w:cs="Times New Roman"/>
+                <w:sz w:val="20"/>
+              </w:rPr>
+              <w:t>Real modules need hardware</w:t>
+            </w:r>
+          </w:p>
+        </w:tc>
+        <w:tc>
+          <w:tcPr>
+            <w:tcW w:w="5669" w:type="dxa"/>
+          </w:tcPr>
+          <w:p>
+            <w:pPr>
+              <w:spacing w:after="40" w:line="240" w:lineRule="auto"/>
+            </w:pPr>
+            <w:r>
+              <w:rPr>
+                <w:rFonts w:cs="Times New Roman"/>
+                <w:sz w:val="20"/>
+              </w:rPr>
+              <w:t>Choose modules that run without hardware (virtual network devices, file systems, block simulators)</w:t>
+            </w:r>
+          </w:p>
+        </w:tc>
+      </w:tr>
+    </w:tbl>
+    <w:p>
+      <w:pPr>
+        <w:spacing w:after="80"/>
+      </w:pPr>
+    </w:p>
+    <w:p>
+      <w:pPr>
+        <w:pStyle w:val="Heading2"/>
+      </w:pPr>
+      <w:r>
+        <w:t>15. References</w:t>
+      </w:r>
+    </w:p>
+    <w:p>
+      <w:pPr>
+        <w:ind w:left="510" w:hanging="510"/>
+      </w:pPr>
+      <w:r>
+        <w:rPr>
+          <w:rFonts w:cs="Times New Roman"/>
+        </w:rPr>
+        <w:t>[1] Wang, W. “MLEE: Effective Detection of Memory Leaks on Early-Exit Paths in OS Kernels.” USENIX Annual Technical Conference (ATC), 2021, pp. 31–45.</w:t>
+      </w:r>
+    </w:p>
+    <w:p>
+      <w:pPr>
+        <w:ind w:left="510" w:hanging="510"/>
+      </w:pPr>
+      <w:r>
+        <w:rPr>
+          <w:rFonts w:cs="Times New Roman"/>
+        </w:rPr>
+        <w:t>[2] Linux kernel documentation: “Kernel Memory Leak Detector (kmemleak).” https://docs.kernel.org/dev-tools/kmemleak.html</w:t>
+      </w:r>
+    </w:p>
+    <w:p>
+      <w:pPr>
+        <w:ind w:left="510" w:hanging="510"/>
+      </w:pPr>
+      <w:r>
+        <w:rPr>
+          <w:rFonts w:cs="Times New Roman"/>
+        </w:rPr>
+        <w:t>[3] Linux kernel documentation: “Fault injection capabilities infrastructure.” https://docs.kernel.org/fault-injection/fault-injection.html</w:t>
+      </w:r>
+    </w:p>
+    <w:p>
+      <w:pPr>
+        <w:ind w:left="510" w:hanging="510"/>
+      </w:pPr>
+      <w:r>
+        <w:rPr>
+          <w:rFonts w:cs="Times New Roman"/>
+        </w:rPr>
+        <w:t>[4] Google. “syzkaller: an unsupervised coverage-guided kernel fuzzer.” https://github.com/google/syzkaller</w:t>
+      </w:r>
+    </w:p>
+    <w:p>
+      <w:pPr>
+        <w:ind w:left="510" w:hanging="510"/>
+      </w:pPr>
+      <w:r>
+        <w:rPr>
+          <w:rFonts w:cs="Times New Roman"/>
+        </w:rPr>
+        <w:t>[5] Emamdoost, N., Wu, Q., Lu, K., McCamant, S. “Detecting Kernel Memory Leaks in Specialized Modules with Ownership Reasoning (K-MELD).” NDSS, 2021.</w:t>
+      </w:r>
+    </w:p>
+    <w:p>
+      <w:pPr>
+        <w:ind w:left="510" w:hanging="510"/>
+      </w:pPr>
+      <w:r>
+        <w:rPr>
+          <w:rFonts w:cs="Times New Roman"/>
+        </w:rPr>
+        <w:t>[6] Lattner, C., Adve, V. “LLVM: A Compilation Framework for Lifelong Program Analysis and Transformation.” CGO, 2004.</w:t>
+      </w:r>
+    </w:p>
+    <w:p>
+      <w:pPr>
+        <w:ind w:left="510" w:hanging="510"/>
+      </w:pPr>
+      <w:r>
+        <w:rPr>
+          <w:rFonts w:cs="Times New Roman"/>
+        </w:rPr>
+        <w:lastRenderedPageBreak/>
+        <w:t>[7] Bellard, F. “QEMU, a Fast and Portable Dynamic Translator.” USENIX ATC, 2005.</w:t>
+      </w:r>
+    </w:p>
+    <w:p>
+      <w:pPr>
+        <w:ind w:left="510" w:hanging="510"/>
+      </w:pPr>
+      <w:r>
+        <w:rPr>
+          <w:rFonts w:cs="Times New Roman"/>
+        </w:rPr>
+        <w:t>[8] Cppcheck: a tool for static C/C++ code analysis. https://cppcheck.sourceforge.io/</w:t>
+      </w:r>
+    </w:p>
+    <w:p>
+      <w:pPr>
+        <w:ind w:left="510" w:hanging="510"/>
+      </w:pPr>
+      <w:r>
+        <w:rPr>
+          <w:rFonts w:cs="Times New Roman"/>
+        </w:rPr>
+        <w:t>[9] Silberschatz, A., Galvin, P. B., Gagne, G. Operating System Concepts, 10th ed. Wiley, 2018.</w:t>
+      </w:r>
+    </w:p>
+    <w:p>
+      <w:pPr>
+        <w:ind w:left="510" w:hanging="510"/>
+      </w:pPr>
+      <w:r>
+        <w:rPr>
+          <w:rFonts w:cs="Times New Roman"/>
+        </w:rPr>
+        <w:t>[10] Corbet, J., Rubini, A., Kroah-Hartman, G. Linux Device Drivers, 3rd ed. O’Reilly, 2005.</w:t>
+      </w:r>
+    </w:p>
     <w:sectPr>
-      <w:footerReference w:type="default" r:id="rId8"/>
+      <w:footerReference w:type="default" r:id="rId10"/>
       <w:pgSz w:w="11906" w:h="16838"/>
       <w:pgMar w:top="1440" w:right="1440" w:bottom="1440" w:left="1440" w:header="708" w:footer="708" w:gutter="0"/>
       <w:cols w:space="708"/>

</xml_diff>